<commit_message>
Rename response to reviewers file
</commit_message>
<xml_diff>
--- a/protocol-publication/response-to-reviewers.docx
+++ b/protocol-publication/response-to-reviewers.docx
@@ -23,10 +23,7 @@
         <w:pStyle w:val="NormalWeb"/>
       </w:pPr>
       <w:r>
-        <w:t>Effects of Advanced Trauma Life Support® Training Compared with Standard Care on Adult Trauma Patient Outcomes (ADVANCE TRAUMA): Study Protocol for a Stepped-Wedge Cluster Randomised Trial</w:t>
-      </w:r>
-      <w:r>
-        <w:t>.</w:t>
+        <w:t>Effects of Advanced Trauma Life Support® Training Compared with Standard Care on Adult Trauma Patient Outcomes (ADVANCE TRAUMA): Study Protocol for a Stepped-Wedge Cluster Randomised Trial.</w:t>
       </w:r>
     </w:p>
     <w:p>
@@ -323,6 +320,8 @@
       </w:r>
       <w:commentRangeStart w:id="0"/>
       <w:commentRangeStart w:id="1"/>
+      <w:commentRangeStart w:id="2"/>
+      <w:commentRangeStart w:id="3"/>
       <w:r>
         <w:t>Provide concrete procedures and responsibilities for ascertaining 30-day status for transferred/discharged patients (who calls, how many attempts, what records are checked). State acceptable sources of confirmation (hospital EHR, death registry, phone with next-of-kin) and planned documentation.</w:t>
       </w:r>
@@ -350,11 +349,26 @@
         </w:rPr>
         <w:commentReference w:id="1"/>
       </w:r>
-    </w:p>
-    <w:p>
-      <w:pPr>
-        <w:pStyle w:val="NormalWeb"/>
-      </w:pPr>
+      <w:commentRangeEnd w:id="2"/>
+      <w:r>
+        <w:rPr>
+          <w:rStyle w:val="CommentReference"/>
+        </w:rPr>
+        <w:commentReference w:id="2"/>
+      </w:r>
+      <w:commentRangeEnd w:id="3"/>
+      <w:r>
+        <w:rPr>
+          <w:rStyle w:val="CommentReference"/>
+        </w:rPr>
+        <w:commentReference w:id="3"/>
+      </w:r>
+    </w:p>
+    <w:p>
+      <w:pPr>
+        <w:pStyle w:val="NormalWeb"/>
+      </w:pPr>
+      <w:commentRangeStart w:id="4"/>
       <w:r>
         <w:rPr>
           <w:b/>
@@ -363,7 +377,17 @@
         <w:t>R2.2</w:t>
       </w:r>
       <w:r>
-        <w:t xml:space="preserve"> We have now clarified that f</w:t>
+        <w:t xml:space="preserve"> </w:t>
+      </w:r>
+      <w:commentRangeEnd w:id="4"/>
+      <w:r>
+        <w:rPr>
+          <w:rStyle w:val="CommentReference"/>
+        </w:rPr>
+        <w:commentReference w:id="4"/>
+      </w:r>
+      <w:r>
+        <w:t>We have now clarified that f</w:t>
       </w:r>
       <w:r>
         <w:t>ollow-up of patient participants is conducted by the Clinical Research Coordinator (CRC) at each site. The site coordinators regularly review clinical notes and hospital registers to determine whether participants have been discharged or transferred. For participants who have been transferred, the CRC conducts telephonic follow-up calls with either the participant or their next of kin.</w:t>
@@ -374,7 +398,19 @@
         <w:pStyle w:val="NormalWeb"/>
       </w:pPr>
       <w:r>
-        <w:t>Deaths are confirmed through verification of hospital records. For outcome assessments such as EQ-5D, WHODAS, and return-to-work status, the CRC makes regular follow-up calls to obtain updates from the participant or their nearest kin. In cases where no contact can be established despite repeated attempts, the participant is classified as a loss to follow-up.</w:t>
+        <w:t xml:space="preserve">Deaths are confirmed through verification of hospital records. For outcome assessments such as EQ-5D, WHODAS, and return-to-work status, the CRC makes regular follow-up calls to obtain updates from the participant or their nearest kin. </w:t>
+      </w:r>
+      <w:r>
+        <w:t xml:space="preserve">By Day 30, at least three to four phone calls </w:t>
+      </w:r>
+      <w:r>
+        <w:t>are</w:t>
+      </w:r>
+      <w:r>
+        <w:t xml:space="preserve"> attempted. Depending on the response, a subsequent telephone follow-up will be scheduled. </w:t>
+      </w:r>
+      <w:r>
+        <w:t>In cases where no contact can be established despite repeated attempts, the participant is classified as a loss to follow-up.</w:t>
       </w:r>
     </w:p>
     <w:p>
@@ -391,12 +427,12 @@
       <w:r>
         <w:t xml:space="preserve"> </w:t>
       </w:r>
-      <w:commentRangeStart w:id="2"/>
-      <w:commentRangeStart w:id="3"/>
+      <w:commentRangeStart w:id="5"/>
+      <w:commentRangeStart w:id="6"/>
       <w:r>
         <w:t>Prespecify how you will handle deaths that cannot be confirmed at 30 days (e.g., treat as alive, treat as missing — and how this choice will be handled in sensitivity analyses). Add an analysis plan for differential loss to follow-up (e.g., inverse-probability weighting or worst-case/best-case sensitivity analyses).</w:t>
       </w:r>
-      <w:commentRangeEnd w:id="2"/>
+      <w:commentRangeEnd w:id="5"/>
       <w:r>
         <w:rPr>
           <w:rStyle w:val="CommentReference"/>
@@ -407,14 +443,14 @@
           <w:lang w:val="en-US" w:eastAsia="en-US"/>
           <w14:ligatures w14:val="standardContextual"/>
         </w:rPr>
-        <w:commentReference w:id="2"/>
-      </w:r>
-      <w:commentRangeEnd w:id="3"/>
+        <w:commentReference w:id="5"/>
+      </w:r>
+      <w:commentRangeEnd w:id="6"/>
       <w:r>
         <w:rPr>
           <w:rStyle w:val="CommentReference"/>
         </w:rPr>
-        <w:commentReference w:id="3"/>
+        <w:commentReference w:id="6"/>
       </w:r>
     </w:p>
     <w:p>
@@ -429,7 +465,14 @@
         <w:t xml:space="preserve">R2.3 </w:t>
       </w:r>
       <w:r>
-        <w:t>Deaths that cannot be confirmed at 30 days will be treated as missing. We will handle missing data in the primary outcome depending on the amount of missing. If there is less than 10% missingness in the primary outcome, then we will conduct a complete case analysis. If there is more than 10% missingness then we will use multiple imputation, unless we have reason to believe that the data may be missing not at random. We have clarified this in the manuscript, item 12 and 20c.</w:t>
+        <w:t>In-hospital mortality is unlikely to be missing. Patients who are discharged alive before day 30 will be considered alive. For all-cause mortality at 30 days and beyond, d</w:t>
+      </w:r>
+      <w:r>
+        <w:t xml:space="preserve">eaths that cannot be confirmed will be treated as missing. We will handle missing data in the primary outcome depending on the amount of missing. If there is less than 10% missingness in the primary outcome, then we will conduct a complete case analysis. If there is more than 10% missingness then we will use multiple imputation, unless we have reason to believe that the </w:t>
+      </w:r>
+      <w:r>
+        <w:lastRenderedPageBreak/>
+        <w:t>data may be missing not at random. We have clarified this in the manuscript, item 12 and 20c.</w:t>
       </w:r>
     </w:p>
     <w:p>
@@ -439,11 +482,11 @@
       <w:r>
         <w:t xml:space="preserve">2) </w:t>
       </w:r>
-      <w:commentRangeStart w:id="4"/>
+      <w:commentRangeStart w:id="7"/>
       <w:r>
         <w:t>Blinding and outcome assessment bias</w:t>
       </w:r>
-      <w:commentRangeEnd w:id="4"/>
+      <w:commentRangeEnd w:id="7"/>
       <w:r>
         <w:rPr>
           <w:rStyle w:val="CommentReference"/>
@@ -454,15 +497,14 @@
           <w:lang w:val="en-US" w:eastAsia="en-US"/>
           <w14:ligatures w14:val="standardContextual"/>
         </w:rPr>
-        <w:commentReference w:id="4"/>
-      </w:r>
-    </w:p>
-    <w:p>
-      <w:pPr>
-        <w:pStyle w:val="NormalWeb"/>
-      </w:pPr>
-      <w:r>
-        <w:lastRenderedPageBreak/>
+        <w:commentReference w:id="7"/>
+      </w:r>
+    </w:p>
+    <w:p>
+      <w:pPr>
+        <w:pStyle w:val="NormalWeb"/>
+      </w:pPr>
+      <w:r>
         <w:t>Issue: No blinding of outcome assessors or data analysts is planned because of time-randomised intervention. While understandable, this raises the possibility of ascertainment bias for outcomes that require judgement (e.g., ICU admission criteria, adherence assessment).</w:t>
       </w:r>
     </w:p>
@@ -496,7 +538,9 @@
       <w:pPr>
         <w:pStyle w:val="NormalWeb"/>
       </w:pPr>
-      <w:commentRangeStart w:id="5"/>
+      <w:commentRangeStart w:id="8"/>
+      <w:commentRangeStart w:id="9"/>
+      <w:commentRangeStart w:id="10"/>
       <w:r>
         <w:rPr>
           <w:b/>
@@ -505,14 +549,65 @@
         <w:t xml:space="preserve">R2.4 </w:t>
       </w:r>
       <w:r>
-        <w:t>Outcome recording will be verified for a sample of observations through remote and on-site monitoring of source data by the coordinating centre. This has been clarified in the manuscript, item 18a.</w:t>
-      </w:r>
-      <w:commentRangeEnd w:id="5"/>
+        <w:rPr>
+          <w:rPrChange w:id="11" w:author="sranjan@masonlive.gmu.edu" w:date="2025-12-05T16:42:00Z" w16du:dateUtc="2025-12-05T21:42:00Z">
+            <w:rPr>
+              <w:b/>
+              <w:bCs/>
+            </w:rPr>
+          </w:rPrChange>
+        </w:rPr>
+        <w:t xml:space="preserve">In case death occurs in the hospital, </w:t>
+      </w:r>
+      <w:r>
+        <w:t xml:space="preserve">a hundred </w:t>
+      </w:r>
+      <w:r>
+        <w:t xml:space="preserve">percent </w:t>
+      </w:r>
+      <w:r>
+        <w:t>review</w:t>
+      </w:r>
+      <w:r>
+        <w:t xml:space="preserve"> of the </w:t>
+      </w:r>
+      <w:r>
+        <w:rPr>
+          <w:rPrChange w:id="12" w:author="sranjan@masonlive.gmu.edu" w:date="2025-12-05T16:42:00Z" w16du:dateUtc="2025-12-05T21:42:00Z">
+            <w:rPr>
+              <w:b/>
+              <w:bCs/>
+            </w:rPr>
+          </w:rPrChange>
+        </w:rPr>
+        <w:t>source data</w:t>
+      </w:r>
+      <w:r>
+        <w:t xml:space="preserve"> is done through onsite and remote monitoring</w:t>
+      </w:r>
+      <w:r>
+        <w:t>. This has been clarified in the manuscript, item 18a.</w:t>
+      </w:r>
+      <w:commentRangeEnd w:id="8"/>
       <w:r>
         <w:rPr>
           <w:rStyle w:val="CommentReference"/>
         </w:rPr>
-        <w:commentReference w:id="5"/>
+        <w:commentReference w:id="8"/>
+      </w:r>
+      <w:commentRangeEnd w:id="9"/>
+      <w:r>
+        <w:rPr>
+          <w:rStyle w:val="CommentReference"/>
+        </w:rPr>
+        <w:commentReference w:id="9"/>
+      </w:r>
+      <w:commentRangeEnd w:id="10"/>
+      <w:r>
+        <w:rPr>
+          <w:rStyle w:val="CommentReference"/>
+        </w:rPr>
+        <w:commentReference w:id="10"/>
       </w:r>
     </w:p>
     <w:p>
@@ -530,7 +625,21 @@
         <w:t xml:space="preserve"> </w:t>
       </w:r>
       <w:r>
-        <w:t>For outcomes subject to ascertainment (ICU admission, length of stay), describe standardised, objective definitions and whether any central adjudication will occur.</w:t>
+        <w:t xml:space="preserve">For outcomes subject to ascertainment (ICU admission, length of stay), describe standardised, </w:t>
+      </w:r>
+      <w:commentRangeStart w:id="13"/>
+      <w:r>
+        <w:t xml:space="preserve">objective definitions </w:t>
+      </w:r>
+      <w:commentRangeEnd w:id="13"/>
+      <w:r>
+        <w:rPr>
+          <w:rStyle w:val="CommentReference"/>
+        </w:rPr>
+        <w:commentReference w:id="13"/>
+      </w:r>
+      <w:r>
+        <w:t>and whether any central adjudication will occur.</w:t>
       </w:r>
     </w:p>
     <w:p>
@@ -547,6 +656,12 @@
       <w:r>
         <w:t>See R2.4.</w:t>
       </w:r>
+      <w:r>
+        <w:t xml:space="preserve"> In addition, ICU admission and length of stay are defined and a</w:t>
+      </w:r>
+      <w:r>
+        <w:t>vailable from the medical records.</w:t>
+      </w:r>
     </w:p>
     <w:p>
       <w:pPr>
@@ -586,16 +701,35 @@
         </w:rPr>
         <w:t xml:space="preserve">R2.6 </w:t>
       </w:r>
-      <w:commentRangeStart w:id="6"/>
-      <w:r>
-        <w:t>Would it be possible to blind the statistician? Won’t allocation be obvious from the data structure?</w:t>
-      </w:r>
-      <w:commentRangeEnd w:id="6"/>
-      <w:r>
-        <w:rPr>
-          <w:rStyle w:val="CommentReference"/>
-        </w:rPr>
-        <w:commentReference w:id="6"/>
+      <w:r>
+        <w:t>For stepped wedge trials it is difficult to blind the analysing statistician since treatment and time are related to each other</w:t>
+      </w:r>
+      <w:r>
+        <w:t xml:space="preserve">. </w:t>
+      </w:r>
+      <w:r>
+        <w:t>Instead</w:t>
+      </w:r>
+      <w:r>
+        <w:t xml:space="preserve">, </w:t>
+      </w:r>
+      <w:r>
+        <w:t>to protect against issues to do with an unblinded analysis of the data</w:t>
+      </w:r>
+      <w:r>
+        <w:t>,</w:t>
+      </w:r>
+      <w:r>
+        <w:t xml:space="preserve"> a full statistical analysis plan – including example code and descriptions of all sensitivity analyses – </w:t>
+      </w:r>
+      <w:r>
+        <w:t xml:space="preserve">will </w:t>
+      </w:r>
+      <w:r>
+        <w:t>be published online prior to the statistician receiving any data</w:t>
+      </w:r>
+      <w:r>
+        <w:t>. This has been clarified in item 17a.</w:t>
       </w:r>
     </w:p>
     <w:p>
@@ -605,11 +739,11 @@
       <w:r>
         <w:t>3</w:t>
       </w:r>
-      <w:commentRangeStart w:id="7"/>
+      <w:commentRangeStart w:id="14"/>
       <w:r>
         <w:t xml:space="preserve">) Statistical analysis </w:t>
       </w:r>
-      <w:commentRangeEnd w:id="7"/>
+      <w:commentRangeEnd w:id="14"/>
       <w:r>
         <w:rPr>
           <w:rStyle w:val="CommentReference"/>
@@ -620,7 +754,7 @@
           <w:lang w:val="en-US" w:eastAsia="en-US"/>
           <w14:ligatures w14:val="standardContextual"/>
         </w:rPr>
-        <w:commentReference w:id="7"/>
+        <w:commentReference w:id="14"/>
       </w:r>
       <w:r>
         <w:t>— small number of clusters and choice of corrections</w:t>
@@ -657,59 +791,108 @@
         <w:t xml:space="preserve"> </w:t>
       </w:r>
       <w:r>
-        <w:t xml:space="preserve">Pre-specify the primary small-sample correction method (or provide a decision algorithm with ranked preferred methods and justification). Common choices: (a) use cluster-level summaries with permutation tests, (b) use GLMM with Kenward-Roger or Satterthwaite </w:t>
+        <w:t>Pre-specify the primary small-sample correction method (or provide a decision algorithm with ranked preferred methods and justification). Common choices: (a) use cluster-level summaries with permutation tests, (b) use GLMM with Kenward-Roger or Satterthwaite df, or (c) use bias-corrected cluster-robust standard errors with a recommended correction (e.g., Webb/</w:t>
       </w:r>
       <w:proofErr w:type="spellStart"/>
       <w:r>
-        <w:t>df</w:t>
+        <w:t>Imbens</w:t>
       </w:r>
       <w:proofErr w:type="spellEnd"/>
       <w:r>
-        <w:t>, or (c) use bias-corrected cluster-robust standard errors with a recommended correction (e.g., Webb/</w:t>
+        <w:t>). Cite supporting references</w:t>
+      </w:r>
+      <w:r>
+        <w:t>.</w:t>
+      </w:r>
+    </w:p>
+    <w:p>
+      <w:pPr>
+        <w:pStyle w:val="NormalWeb"/>
+      </w:pPr>
+      <w:r>
+        <w:rPr>
+          <w:b/>
+          <w:bCs/>
+        </w:rPr>
+        <w:t xml:space="preserve">R2.7 </w:t>
+      </w:r>
+      <w:r>
+        <w:t>What small-sample correction method to use is an active area of research, particularly in the context of stepped-wedge and batched stepped-wedge designs. We have</w:t>
+      </w:r>
+      <w:r>
+        <w:t xml:space="preserve"> now specified </w:t>
+      </w:r>
+      <w:r>
+        <w:lastRenderedPageBreak/>
+        <w:t xml:space="preserve">that we will use </w:t>
+      </w:r>
+      <w:bookmarkStart w:id="15" w:name="_Hlk216065990"/>
+      <w:r>
+        <w:t>a Kenward Roger correction</w:t>
+      </w:r>
+      <w:r>
+        <w:t xml:space="preserve"> </w:t>
+      </w:r>
+      <w:bookmarkEnd w:id="15"/>
+      <w:r>
+        <w:t xml:space="preserve">as our primary </w:t>
+      </w:r>
+      <w:proofErr w:type="gramStart"/>
+      <w:r>
+        <w:t>method, but</w:t>
+      </w:r>
+      <w:proofErr w:type="gramEnd"/>
+      <w:r>
+        <w:t xml:space="preserve"> will potentially update this choice if there </w:t>
+      </w:r>
+      <w:proofErr w:type="gramStart"/>
+      <w:r>
+        <w:t>is</w:t>
+      </w:r>
+      <w:proofErr w:type="gramEnd"/>
+      <w:r>
+        <w:t xml:space="preserve"> new methods work supporting other methods closer to the end of patient inclusion.</w:t>
+      </w:r>
+    </w:p>
+    <w:p>
+      <w:pPr>
+        <w:pStyle w:val="NormalWeb"/>
+      </w:pPr>
+      <w:r>
+        <w:rPr>
+          <w:b/>
+          <w:bCs/>
+        </w:rPr>
+        <w:t>Q2.8</w:t>
+      </w:r>
+      <w:r>
+        <w:t xml:space="preserve"> </w:t>
+      </w:r>
+      <w:r>
+        <w:t xml:space="preserve">Clearly state the primary </w:t>
       </w:r>
       <w:proofErr w:type="spellStart"/>
       <w:r>
-        <w:t>Imbens</w:t>
+        <w:t>estimand</w:t>
       </w:r>
       <w:proofErr w:type="spellEnd"/>
       <w:r>
-        <w:t>). Cite supporting references</w:t>
-      </w:r>
-      <w:r>
-        <w:t>.</w:t>
-      </w:r>
-    </w:p>
-    <w:p>
-      <w:pPr>
-        <w:pStyle w:val="NormalWeb"/>
-      </w:pPr>
-      <w:r>
-        <w:rPr>
-          <w:b/>
-          <w:bCs/>
-        </w:rPr>
-        <w:t xml:space="preserve">R2.7 </w:t>
-      </w:r>
-      <w:r>
-        <w:t xml:space="preserve">What small-sample correction method to use is an active area of research, particularly in the context of stepped-wedge and batched stepped-wedge designs. We have therefore decided not to specify the small sample correction that we will use, but instead justify our final choice based on the latest literature before patient inclusion has stopped. </w:t>
-      </w:r>
-    </w:p>
-    <w:p>
-      <w:pPr>
-        <w:pStyle w:val="NormalWeb"/>
-      </w:pPr>
-      <w:r>
-        <w:rPr>
-          <w:b/>
-          <w:bCs/>
-        </w:rPr>
-        <w:t>Q2.8</w:t>
-      </w:r>
-      <w:r>
-        <w:t xml:space="preserve"> </w:t>
-      </w:r>
-      <w:r>
-        <w:t xml:space="preserve">Clearly state the primary </w:t>
+        <w:t xml:space="preserve"> (risk difference or risk ratio/OR) and primary modelling choice (e.g., binomial identity model for risk difference; if non-convergence, report odds ratio). You already mention this — but make it explicit which effect will be the main inference and how small-cluster bias will be corrected.</w:t>
+      </w:r>
+    </w:p>
+    <w:p>
+      <w:pPr>
+        <w:pStyle w:val="NormalWeb"/>
+      </w:pPr>
+      <w:r>
+        <w:rPr>
+          <w:b/>
+          <w:bCs/>
+        </w:rPr>
+        <w:t xml:space="preserve">R2.9 </w:t>
+      </w:r>
+      <w:r>
+        <w:t xml:space="preserve">The primary </w:t>
       </w:r>
       <w:proofErr w:type="spellStart"/>
       <w:r>
@@ -717,30 +900,6 @@
       </w:r>
       <w:proofErr w:type="spellEnd"/>
       <w:r>
-        <w:t xml:space="preserve"> (risk difference or risk ratio/OR) and primary modelling choice (e.g., binomial identity model for risk difference; if non-convergence, report odds ratio). You already mention this — but make it explicit which effect will be the main inference and how small-cluster bias will be corrected.</w:t>
-      </w:r>
-    </w:p>
-    <w:p>
-      <w:pPr>
-        <w:pStyle w:val="NormalWeb"/>
-      </w:pPr>
-      <w:r>
-        <w:rPr>
-          <w:b/>
-          <w:bCs/>
-        </w:rPr>
-        <w:lastRenderedPageBreak/>
-        <w:t xml:space="preserve">R2.9 </w:t>
-      </w:r>
-      <w:r>
-        <w:t xml:space="preserve">The primary </w:t>
-      </w:r>
-      <w:proofErr w:type="spellStart"/>
-      <w:r>
-        <w:t>estimand</w:t>
-      </w:r>
-      <w:proofErr w:type="spellEnd"/>
-      <w:r>
         <w:t xml:space="preserve"> will be the odds ratio. This has been clarified under item 20a.</w:t>
       </w:r>
     </w:p>
@@ -764,11 +923,12 @@
       <w:pPr>
         <w:pStyle w:val="NormalWeb"/>
       </w:pPr>
-      <w:commentRangeStart w:id="8"/>
+      <w:commentRangeStart w:id="16"/>
+      <w:commentRangeStart w:id="17"/>
       <w:r>
         <w:t>Suggested actions</w:t>
       </w:r>
-      <w:commentRangeEnd w:id="8"/>
+      <w:commentRangeEnd w:id="16"/>
       <w:r>
         <w:rPr>
           <w:rStyle w:val="CommentReference"/>
@@ -779,7 +939,14 @@
           <w:lang w:val="en-US" w:eastAsia="en-US"/>
           <w14:ligatures w14:val="standardContextual"/>
         </w:rPr>
-        <w:commentReference w:id="8"/>
+        <w:commentReference w:id="16"/>
+      </w:r>
+      <w:commentRangeEnd w:id="17"/>
+      <w:r>
+        <w:rPr>
+          <w:rStyle w:val="CommentReference"/>
+        </w:rPr>
+        <w:commentReference w:id="17"/>
       </w:r>
       <w:r>
         <w:t>:</w:t>
@@ -822,7 +989,31 @@
         <w:t xml:space="preserve"> </w:t>
       </w:r>
       <w:r>
-        <w:t>We will conduct the analysis with the time effect modelled using a spline function regardless of whether we think that a strong secular trend is present, thus there is no need to specify thresholds.</w:t>
+        <w:t xml:space="preserve">Period effects will be adjusted for in all </w:t>
+      </w:r>
+      <w:proofErr w:type="gramStart"/>
+      <w:r>
+        <w:t>models</w:t>
+      </w:r>
+      <w:proofErr w:type="gramEnd"/>
+      <w:r>
+        <w:t xml:space="preserve"> and this will account for secular trends.</w:t>
+      </w:r>
+      <w:r>
+        <w:rPr>
+          <w:b/>
+          <w:bCs/>
+        </w:rPr>
+        <w:t xml:space="preserve"> </w:t>
+      </w:r>
+      <w:r>
+        <w:t xml:space="preserve">We will </w:t>
+      </w:r>
+      <w:r>
+        <w:t xml:space="preserve">however </w:t>
+      </w:r>
+      <w:r>
+        <w:t>conduct the analysis with the time effect modelled using a spline function regardless of whether we think that a strong secular trend is present, thus there is no need to specify thresholds.</w:t>
       </w:r>
     </w:p>
     <w:p>
@@ -857,6 +1048,15 @@
       <w:r>
         <w:t>We will not re-estimate the sample size in the interim analysis, see section 21b. Variable cluster sizes were accounted for in the original sample size calculation, based on data from previous projects.</w:t>
       </w:r>
+      <w:r>
+        <w:t xml:space="preserve"> Also, o</w:t>
+      </w:r>
+      <w:r>
+        <w:t>ur chosen analysis approach (generalised linear mixed models) does not require any explicit consideration of how varying cluster sizes will be accommodated at the analysis stage. Nonetheless, we might anticipate that the intervention effect might differ in smaller vs larger hospitals and so we have therefore added a sub-group analysis in which we will investigate treatment effect heterogeneity by cluster size</w:t>
+      </w:r>
+      <w:r>
+        <w:t xml:space="preserve">, </w:t>
+      </w:r>
     </w:p>
     <w:p>
       <w:pPr>
@@ -896,11 +1096,15 @@
       <w:r>
         <w:t xml:space="preserve"> </w:t>
       </w:r>
-      <w:commentRangeStart w:id="9"/>
-      <w:r>
-        <w:t>Clarify the exact objectives of the interim review and prespecified quantitative criteria that would trigger stopping (for feasibility) and how the SDMC will make recommendations. If no efficacy stopping is planned, state explicitly. If harm could prompt stopping, set specific thresholds or statistical boundaries (or explain why not applicable).</w:t>
-      </w:r>
-      <w:commentRangeEnd w:id="9"/>
+      <w:commentRangeStart w:id="18"/>
+      <w:r>
+        <w:t xml:space="preserve">Clarify the exact objectives of the interim review and prespecified quantitative criteria that would trigger stopping (for feasibility) and how the SDMC will make recommendations. </w:t>
+      </w:r>
+      <w:r>
+        <w:lastRenderedPageBreak/>
+        <w:t>If no efficacy stopping is planned, state explicitly. If harm could prompt stopping, set specific thresholds or statistical boundaries (or explain why not applicable).</w:t>
+      </w:r>
+      <w:commentRangeEnd w:id="18"/>
       <w:r>
         <w:rPr>
           <w:rStyle w:val="CommentReference"/>
@@ -911,7 +1115,7 @@
           <w:lang w:val="en-US" w:eastAsia="en-US"/>
           <w14:ligatures w14:val="standardContextual"/>
         </w:rPr>
-        <w:commentReference w:id="9"/>
+        <w:commentReference w:id="18"/>
       </w:r>
     </w:p>
     <w:p>
@@ -957,7 +1161,6 @@
         <w:pStyle w:val="NormalWeb"/>
       </w:pPr>
       <w:r>
-        <w:lastRenderedPageBreak/>
         <w:t>Suggested actions:</w:t>
       </w:r>
     </w:p>
@@ -979,15 +1182,15 @@
         </w:rPr>
         <w:t xml:space="preserve"> </w:t>
       </w:r>
-      <w:commentRangeStart w:id="10"/>
-      <w:commentRangeStart w:id="11"/>
+      <w:commentRangeStart w:id="19"/>
+      <w:commentRangeStart w:id="20"/>
       <w:r>
         <w:rPr>
           <w:color w:val="000000" w:themeColor="text1"/>
         </w:rPr>
         <w:t>Include the exact text (or a summary) of patient information sheets and how opt-out is communicated at arrival (timing, language, signage). State whether local ethics committees approved opt-out/waiver approaches (you indicate approvals but list only 1-2 bodies). Provide the ethical approval reference numbers in the main text.</w:t>
       </w:r>
-      <w:commentRangeEnd w:id="10"/>
+      <w:commentRangeEnd w:id="19"/>
       <w:r>
         <w:rPr>
           <w:rStyle w:val="CommentReference"/>
@@ -999,9 +1202,9 @@
           <w:lang w:val="en-US" w:eastAsia="en-US"/>
           <w14:ligatures w14:val="standardContextual"/>
         </w:rPr>
-        <w:commentReference w:id="10"/>
-      </w:r>
-      <w:commentRangeEnd w:id="11"/>
+        <w:commentReference w:id="19"/>
+      </w:r>
+      <w:commentRangeEnd w:id="20"/>
       <w:r>
         <w:rPr>
           <w:rStyle w:val="CommentReference"/>
@@ -1013,15 +1216,12 @@
           <w:lang w:val="en-US" w:eastAsia="en-US"/>
           <w14:ligatures w14:val="standardContextual"/>
         </w:rPr>
-        <w:commentReference w:id="11"/>
-      </w:r>
-    </w:p>
-    <w:p>
-      <w:pPr>
-        <w:pStyle w:val="NormalWeb"/>
-        <w:rPr>
-          <w:ins w:id="12" w:author="sranjan@masonlive.gmu.edu" w:date="2025-11-11T11:36:00Z" w16du:dateUtc="2025-11-11T16:36:00Z"/>
-        </w:rPr>
+        <w:commentReference w:id="20"/>
+      </w:r>
+    </w:p>
+    <w:p>
+      <w:pPr>
+        <w:pStyle w:val="NormalWeb"/>
       </w:pPr>
       <w:r>
         <w:rPr>
@@ -1033,74 +1233,520 @@
       <w:r>
         <w:t xml:space="preserve"> </w:t>
       </w:r>
-      <w:commentRangeStart w:id="13"/>
-      <w:ins w:id="14" w:author="sranjan@masonlive.gmu.edu" w:date="2025-11-11T11:36:00Z" w16du:dateUtc="2025-11-11T16:36:00Z">
-        <w:r>
-          <w:t>[Add text from consent]</w:t>
-        </w:r>
-      </w:ins>
-      <w:commentRangeEnd w:id="13"/>
+      <w:r>
+        <w:t xml:space="preserve">The English text is available below. </w:t>
+      </w:r>
+      <w:r>
+        <w:t>Since the trial is pan India,</w:t>
+      </w:r>
+      <w:r>
+        <w:t xml:space="preserve"> the</w:t>
+      </w:r>
+      <w:r>
+        <w:t xml:space="preserve"> consent form has been translated into the regional languages. </w:t>
+      </w:r>
+      <w:r>
+        <w:t xml:space="preserve">The </w:t>
+      </w:r>
+      <w:r>
+        <w:t>CRC takes the consent in the local languages, which the participants or its relatives are in comfortable with.</w:t>
+      </w:r>
+      <w:r>
+        <w:t xml:space="preserve"> The local ethics committees have approved the consent model.</w:t>
+      </w:r>
+    </w:p>
+    <w:p>
+      <w:pPr>
+        <w:pStyle w:val="NormalWeb"/>
+      </w:pPr>
+      <w:r>
+        <w:t>Text from information sheet:</w:t>
+      </w:r>
+    </w:p>
+    <w:p>
+      <w:pPr>
+        <w:spacing w:line="276" w:lineRule="auto"/>
+        <w:jc w:val="both"/>
+      </w:pPr>
+      <w:r>
+        <w:t>You are invited to participate in a research study. Before deciding to take part, it's important to understand the purpose of this research and what it involves. Please read the following information carefully and feel free to discuss the study with others if you wish. If anything is unclear or if you would like more information, do not hesitate to ask us. Please take your time to decide whether you wish to participate.</w:t>
+      </w:r>
+    </w:p>
+    <w:p>
+      <w:pPr>
+        <w:spacing w:line="276" w:lineRule="auto"/>
+      </w:pPr>
+      <w:r>
+        <w:t>Purpose of the Study and Potential Outcomes</w:t>
+      </w:r>
+    </w:p>
+    <w:p>
+      <w:pPr>
+        <w:pStyle w:val="ListParagraph"/>
+        <w:numPr>
+          <w:ilvl w:val="0"/>
+          <w:numId w:val="1"/>
+        </w:numPr>
+        <w:shd w:val="clear" w:color="auto" w:fill="auto"/>
+        <w:spacing w:beforeAutospacing="0" w:afterAutospacing="0" w:line="276" w:lineRule="auto"/>
+      </w:pPr>
+      <w:r>
+        <w:t>What is the purpose of the study?</w:t>
+      </w:r>
+    </w:p>
+    <w:p>
+      <w:pPr>
+        <w:spacing w:line="276" w:lineRule="auto"/>
+        <w:jc w:val="both"/>
+      </w:pPr>
+      <w:r>
+        <w:t>We are conducting a study at this hospital to determine whether special training, known as Advanced Trauma Life Support (ATLS), provided to doctors, improves the care and outcomes for trauma patients.</w:t>
+      </w:r>
+    </w:p>
+    <w:p>
+      <w:pPr>
+        <w:pStyle w:val="ListParagraph"/>
+        <w:numPr>
+          <w:ilvl w:val="0"/>
+          <w:numId w:val="1"/>
+        </w:numPr>
+        <w:shd w:val="clear" w:color="auto" w:fill="auto"/>
+        <w:spacing w:beforeAutospacing="0" w:afterAutospacing="0" w:line="276" w:lineRule="auto"/>
+        <w:jc w:val="both"/>
+      </w:pPr>
+      <w:r>
+        <w:t>What does the intervention involve?</w:t>
+      </w:r>
+    </w:p>
+    <w:p>
+      <w:pPr>
+        <w:spacing w:line="276" w:lineRule="auto"/>
+        <w:jc w:val="both"/>
+      </w:pPr>
+      <w:r>
+        <w:t>You will not receive any direct intervention as part of this study. The intervention consists of a two-and-a-half-day specialized training course for the doctors who will be treating you.</w:t>
+      </w:r>
+    </w:p>
+    <w:p>
+      <w:pPr>
+        <w:pStyle w:val="ListParagraph"/>
+        <w:numPr>
+          <w:ilvl w:val="0"/>
+          <w:numId w:val="1"/>
+        </w:numPr>
+        <w:shd w:val="clear" w:color="auto" w:fill="auto"/>
+        <w:spacing w:beforeAutospacing="0" w:afterAutospacing="0" w:line="276" w:lineRule="auto"/>
+        <w:jc w:val="both"/>
+      </w:pPr>
+      <w:r>
+        <w:t>Why have I been invited?</w:t>
+      </w:r>
+    </w:p>
+    <w:p>
+      <w:pPr>
+        <w:spacing w:line="276" w:lineRule="auto"/>
+        <w:jc w:val="both"/>
+      </w:pPr>
+      <w:r>
+        <w:lastRenderedPageBreak/>
+        <w:t>You have been invited to participate in this study because you were admitted to this hospital after an injury. We plan to include more than 4,000 participants from 30 hospitals across India.</w:t>
+      </w:r>
+    </w:p>
+    <w:p>
+      <w:pPr>
+        <w:pStyle w:val="ListParagraph"/>
+        <w:numPr>
+          <w:ilvl w:val="0"/>
+          <w:numId w:val="1"/>
+        </w:numPr>
+        <w:shd w:val="clear" w:color="auto" w:fill="auto"/>
+        <w:spacing w:beforeAutospacing="0" w:afterAutospacing="0" w:line="276" w:lineRule="auto"/>
+        <w:jc w:val="both"/>
+      </w:pPr>
+      <w:r>
+        <w:t>What will happen if I participate?</w:t>
+      </w:r>
+    </w:p>
+    <w:p>
+      <w:pPr>
+        <w:spacing w:line="276" w:lineRule="auto"/>
+        <w:jc w:val="both"/>
+      </w:pPr>
+      <w:r>
+        <w:t>During your hospital stay, we will collect certain information required for this study from your routine medical records. This includes your age, gender, medical history, details of your injury, and the treatment you received. During the study's follow-up phase, the hospital research team will:</w:t>
+      </w:r>
+    </w:p>
+    <w:p>
+      <w:pPr>
+        <w:pStyle w:val="ListParagraph"/>
+        <w:numPr>
+          <w:ilvl w:val="0"/>
+          <w:numId w:val="2"/>
+        </w:numPr>
+        <w:shd w:val="clear" w:color="auto" w:fill="auto"/>
+        <w:spacing w:beforeAutospacing="0" w:afterAutospacing="0" w:line="276" w:lineRule="auto"/>
+        <w:jc w:val="both"/>
+      </w:pPr>
+      <w:r>
+        <w:t>Call you or a relative one day after your arrival at the hospital to check on your well-being. If you are still in the hospital, we may visit you in the ward.</w:t>
+      </w:r>
+    </w:p>
+    <w:p>
+      <w:pPr>
+        <w:pStyle w:val="ListParagraph"/>
+        <w:numPr>
+          <w:ilvl w:val="0"/>
+          <w:numId w:val="2"/>
+        </w:numPr>
+        <w:shd w:val="clear" w:color="auto" w:fill="auto"/>
+        <w:spacing w:beforeAutospacing="0" w:afterAutospacing="0" w:line="276" w:lineRule="auto"/>
+        <w:jc w:val="both"/>
+      </w:pPr>
+      <w:r>
+        <w:t>Call you or a relative 30 days after your arrival to check on your well-being. We may visit if you are still in the hospital.</w:t>
+      </w:r>
+    </w:p>
+    <w:p>
+      <w:pPr>
+        <w:pStyle w:val="ListParagraph"/>
+        <w:numPr>
+          <w:ilvl w:val="0"/>
+          <w:numId w:val="2"/>
+        </w:numPr>
+        <w:shd w:val="clear" w:color="auto" w:fill="auto"/>
+        <w:spacing w:beforeAutospacing="0" w:afterAutospacing="0" w:line="276" w:lineRule="auto"/>
+        <w:jc w:val="both"/>
+      </w:pPr>
+      <w:r>
+        <w:t>Call you or a relative three months (90 days) after your arrival to check on your well-being. If you are still in the hospital, we may visit you in the ward. During this time, we may also conduct a short interview, lasting less than five minutes, to inquire about your health status.</w:t>
+      </w:r>
+    </w:p>
+    <w:p>
+      <w:pPr>
+        <w:pStyle w:val="ListParagraph"/>
+        <w:numPr>
+          <w:ilvl w:val="0"/>
+          <w:numId w:val="1"/>
+        </w:numPr>
+        <w:shd w:val="clear" w:color="auto" w:fill="auto"/>
+        <w:spacing w:beforeAutospacing="0" w:afterAutospacing="0" w:line="276" w:lineRule="auto"/>
+        <w:jc w:val="both"/>
+      </w:pPr>
+      <w:r>
+        <w:t>Do I have to participate?</w:t>
+      </w:r>
+    </w:p>
+    <w:p>
+      <w:pPr>
+        <w:spacing w:line="276" w:lineRule="auto"/>
+        <w:jc w:val="both"/>
+      </w:pPr>
+      <w:r>
+        <w:t>Participation in this study is entirely voluntary. For the follow-up phase of this study (after hospital discharge), we may request you or your relative to sign an Informed Consent Form. However, you are free to change your mind and request us to stop collecting follow-up data at any time without providing a reason. Choosing not to be contacted for follow-up data collection will not affect your future medical treatment or standard care in any way. Any data already collected from your medical records will continue to be used in the analysis, unless you or your relative ask the site research team not to use the previously collected data by signing an 'opt-out' form, which is enclosed with this information sheet. The details of the site research team are provided in this document.</w:t>
+      </w:r>
+    </w:p>
+    <w:p>
+      <w:pPr>
+        <w:pStyle w:val="ListParagraph"/>
+        <w:numPr>
+          <w:ilvl w:val="0"/>
+          <w:numId w:val="1"/>
+        </w:numPr>
+        <w:shd w:val="clear" w:color="auto" w:fill="auto"/>
+        <w:spacing w:beforeAutospacing="0" w:afterAutospacing="0" w:line="276" w:lineRule="auto"/>
+        <w:jc w:val="both"/>
+      </w:pPr>
+      <w:r>
+        <w:t>What will I be required to do?</w:t>
+      </w:r>
+    </w:p>
+    <w:p>
+      <w:pPr>
+        <w:spacing w:line="276" w:lineRule="auto"/>
+        <w:jc w:val="both"/>
+      </w:pPr>
+      <w:r>
+        <w:t>You will be asked to provide responses to questions about your health and recovery during telephonic follow-ups or in-person follow-up visits.</w:t>
+      </w:r>
+    </w:p>
+    <w:p>
+      <w:pPr>
+        <w:pStyle w:val="ListParagraph"/>
+        <w:numPr>
+          <w:ilvl w:val="0"/>
+          <w:numId w:val="1"/>
+        </w:numPr>
+        <w:shd w:val="clear" w:color="auto" w:fill="auto"/>
+        <w:spacing w:beforeAutospacing="0" w:afterAutospacing="0" w:line="276" w:lineRule="auto"/>
+        <w:jc w:val="both"/>
+      </w:pPr>
+      <w:r>
+        <w:t>What are the side effects of the intervention?</w:t>
+      </w:r>
+    </w:p>
+    <w:p>
+      <w:pPr>
+        <w:spacing w:line="276" w:lineRule="auto"/>
+        <w:jc w:val="both"/>
+      </w:pPr>
+      <w:r>
+        <w:t>There are no foreseeable side effects of this intervention, as no direct intervention will be administered to you.</w:t>
+      </w:r>
+    </w:p>
+    <w:p>
+      <w:pPr>
+        <w:pStyle w:val="ListParagraph"/>
+        <w:numPr>
+          <w:ilvl w:val="0"/>
+          <w:numId w:val="1"/>
+        </w:numPr>
+        <w:shd w:val="clear" w:color="auto" w:fill="auto"/>
+        <w:spacing w:beforeAutospacing="0" w:afterAutospacing="0" w:line="276" w:lineRule="auto"/>
+        <w:jc w:val="both"/>
+      </w:pPr>
+      <w:r>
+        <w:t>What are the potential disadvantages and risks of participating?</w:t>
+      </w:r>
+    </w:p>
+    <w:p>
+      <w:pPr>
+        <w:spacing w:line="276" w:lineRule="auto"/>
+        <w:jc w:val="both"/>
+      </w:pPr>
+      <w:r>
+        <w:t>We have not identified any risks associated with participating in this study.</w:t>
+      </w:r>
+    </w:p>
+    <w:p>
+      <w:pPr>
+        <w:pStyle w:val="ListParagraph"/>
+        <w:numPr>
+          <w:ilvl w:val="0"/>
+          <w:numId w:val="1"/>
+        </w:numPr>
+        <w:shd w:val="clear" w:color="auto" w:fill="auto"/>
+        <w:spacing w:beforeAutospacing="0" w:afterAutospacing="0" w:line="276" w:lineRule="auto"/>
+        <w:jc w:val="both"/>
+      </w:pPr>
+      <w:r>
+        <w:t>What are the possible benefits of participating?</w:t>
+      </w:r>
+    </w:p>
+    <w:p>
+      <w:pPr>
+        <w:spacing w:line="276" w:lineRule="auto"/>
+        <w:jc w:val="both"/>
+      </w:pPr>
+      <w:r>
+        <w:lastRenderedPageBreak/>
+        <w:t>Our research may help to discover tools that better identify injured patients in need of immediate care. While this research will not affect the care you receive in this hospital, its results may benefit others who are injured in the future. There is no guarantee that you will benefit directly from this study. However, your participation will contribute to medical knowledge about the use of this intervention.</w:t>
+      </w:r>
+    </w:p>
+    <w:p>
+      <w:pPr>
+        <w:pStyle w:val="ListParagraph"/>
+        <w:numPr>
+          <w:ilvl w:val="0"/>
+          <w:numId w:val="1"/>
+        </w:numPr>
+        <w:shd w:val="clear" w:color="auto" w:fill="auto"/>
+        <w:spacing w:beforeAutospacing="0" w:afterAutospacing="0" w:line="276" w:lineRule="auto"/>
+        <w:jc w:val="both"/>
+      </w:pPr>
+      <w:r>
+        <w:t>Can I be compensated for participating?</w:t>
+      </w:r>
+    </w:p>
+    <w:p>
+      <w:pPr>
+        <w:spacing w:line="276" w:lineRule="auto"/>
+        <w:jc w:val="both"/>
+      </w:pPr>
+      <w:r>
+        <w:t>You will not receive any payment for participating in this study.</w:t>
+      </w:r>
+    </w:p>
+    <w:p>
+      <w:pPr>
+        <w:pStyle w:val="ListParagraph"/>
+        <w:numPr>
+          <w:ilvl w:val="0"/>
+          <w:numId w:val="1"/>
+        </w:numPr>
+        <w:shd w:val="clear" w:color="auto" w:fill="auto"/>
+        <w:spacing w:beforeAutospacing="0" w:afterAutospacing="0" w:line="276" w:lineRule="auto"/>
+        <w:jc w:val="both"/>
+      </w:pPr>
+      <w:r>
+        <w:t>What if I decide I no longer wish to participate?</w:t>
+      </w:r>
+    </w:p>
+    <w:p>
+      <w:pPr>
+        <w:spacing w:line="276" w:lineRule="auto"/>
+        <w:jc w:val="both"/>
+      </w:pPr>
+      <w:r>
+        <w:t>You are free to withdraw from this study at any time without needing to provide a reason. Your decision will not affect your future care or medical treatment.</w:t>
+      </w:r>
+    </w:p>
+    <w:p>
+      <w:pPr>
+        <w:pStyle w:val="ListParagraph"/>
+        <w:numPr>
+          <w:ilvl w:val="0"/>
+          <w:numId w:val="1"/>
+        </w:numPr>
+        <w:shd w:val="clear" w:color="auto" w:fill="auto"/>
+        <w:spacing w:beforeAutospacing="0" w:afterAutospacing="0" w:line="276" w:lineRule="auto"/>
+        <w:jc w:val="both"/>
+      </w:pPr>
+      <w:r>
+        <w:t>Will my participation in this study be kept confidential?</w:t>
+      </w:r>
+    </w:p>
+    <w:p>
+      <w:pPr>
+        <w:spacing w:line="276" w:lineRule="auto"/>
+        <w:jc w:val="both"/>
+      </w:pPr>
+      <w:r>
+        <w:t>All information collected about you as part of your participation in this study will be kept strictly confidential and used solely for research purposes. Your information will be anonymized and stored on a highly secured server. All de-identified information about you will be managed in accordance with Indian data protection laws to ensure the utmost confidentiality. At the end of the study, your anonymized and grouped data may be shared with researchers outside the George Institute for Global Health, both in India and internationally, to further advance knowledge on injury care.</w:t>
+      </w:r>
+    </w:p>
+    <w:p>
+      <w:pPr>
+        <w:pStyle w:val="ListParagraph"/>
+        <w:numPr>
+          <w:ilvl w:val="0"/>
+          <w:numId w:val="1"/>
+        </w:numPr>
+        <w:shd w:val="clear" w:color="auto" w:fill="auto"/>
+        <w:spacing w:beforeAutospacing="0" w:afterAutospacing="0" w:line="276" w:lineRule="auto"/>
+        <w:jc w:val="both"/>
+      </w:pPr>
+      <w:r>
+        <w:t>What will happen to the results of this study?</w:t>
+      </w:r>
+    </w:p>
+    <w:p>
+      <w:pPr>
+        <w:spacing w:line="276" w:lineRule="auto"/>
+        <w:jc w:val="both"/>
+      </w:pPr>
+      <w:r>
+        <w:t>The findings of this research may be published in scientific journals; however, it will not be possible to identify you from any published article. Additionally, data from this project may be shared with other researchers in India and abroad without revealing your identity.</w:t>
+      </w:r>
+    </w:p>
+    <w:p>
+      <w:pPr>
+        <w:pStyle w:val="ListParagraph"/>
+        <w:numPr>
+          <w:ilvl w:val="0"/>
+          <w:numId w:val="1"/>
+        </w:numPr>
+        <w:shd w:val="clear" w:color="auto" w:fill="auto"/>
+        <w:spacing w:beforeAutospacing="0" w:afterAutospacing="0" w:line="276" w:lineRule="auto"/>
+        <w:jc w:val="both"/>
+      </w:pPr>
+      <w:r>
+        <w:t>Who is funding this study?</w:t>
+      </w:r>
+    </w:p>
+    <w:p>
+      <w:pPr>
+        <w:spacing w:line="276" w:lineRule="auto"/>
+        <w:jc w:val="both"/>
+      </w:pPr>
+      <w:r>
+        <w:t xml:space="preserve">This study is supported by the Karolinska </w:t>
+      </w:r>
+      <w:proofErr w:type="spellStart"/>
+      <w:r>
+        <w:t>Institutet</w:t>
+      </w:r>
+      <w:proofErr w:type="spellEnd"/>
+      <w:r>
+        <w:t>, Sweden, through a grant from the Swedish Research Council.</w:t>
+      </w:r>
+    </w:p>
+    <w:p>
+      <w:pPr>
+        <w:spacing w:line="276" w:lineRule="auto"/>
+        <w:jc w:val="both"/>
+      </w:pPr>
+      <w:r>
+        <w:t>If you have questions about this research study, you may contact the Principal Investigator.</w:t>
+      </w:r>
+    </w:p>
+    <w:p>
+      <w:pPr>
+        <w:pStyle w:val="NormalWeb"/>
+      </w:pPr>
+      <w:r>
+        <w:rPr>
+          <w:b/>
+          <w:bCs/>
+        </w:rPr>
+        <w:t>Opt out summary:</w:t>
+      </w:r>
+      <w:r>
+        <w:t xml:space="preserve"> 1. I hereby request deletion of any routine medical information previously collected about me (or my relative) and ask that no further data be collected for this study.</w:t>
+      </w:r>
+      <w:r>
+        <w:br/>
+        <w:t>2. I also request that we not be contacted — by phone or in person — for any follow-up data collection.</w:t>
+      </w:r>
+    </w:p>
+    <w:p>
+      <w:pPr>
+        <w:pStyle w:val="NormalWeb"/>
+      </w:pPr>
+      <w:r>
+        <w:rPr>
+          <w:b/>
+          <w:bCs/>
+        </w:rPr>
+        <w:lastRenderedPageBreak/>
+        <w:t>Q2.13</w:t>
+      </w:r>
+      <w:r>
+        <w:t xml:space="preserve"> </w:t>
+      </w:r>
+      <w:r>
+        <w:t>Clarify process for obtaining proxy consent and for post-recovery consent from previously unconscious participants, including time windows and how refusal would be handled for already collected data.</w:t>
+      </w:r>
+    </w:p>
+    <w:p>
+      <w:pPr>
+        <w:pStyle w:val="NormalWeb"/>
+      </w:pPr>
+      <w:r>
+        <w:rPr>
+          <w:b/>
+          <w:bCs/>
+        </w:rPr>
+        <w:t>R2.13</w:t>
+      </w:r>
+      <w:r>
+        <w:t xml:space="preserve"> </w:t>
+      </w:r>
+      <w:r>
+        <w:t xml:space="preserve">Participant consent is obtained by the designated CRC at each site, either from the participant or from the nearest kin, </w:t>
+      </w:r>
+      <w:commentRangeStart w:id="21"/>
+      <w:r>
+        <w:t>depending on the participant’s level of consciousness</w:t>
+      </w:r>
+      <w:commentRangeEnd w:id="21"/>
       <w:r>
         <w:rPr>
           <w:rStyle w:val="CommentReference"/>
         </w:rPr>
-        <w:commentReference w:id="13"/>
-      </w:r>
-    </w:p>
-    <w:p>
-      <w:pPr>
-        <w:pStyle w:val="NormalWeb"/>
-      </w:pPr>
-      <w:ins w:id="15" w:author="sranjan@masonlive.gmu.edu" w:date="2025-11-11T11:36:00Z" w16du:dateUtc="2025-11-11T16:36:00Z">
-        <w:r>
-          <w:t>Since the trial is pan India, consent form has been translated into the regional languages. CRC takes the consent in the local languages, which the participants or its relatives are in comfortable with.</w:t>
-        </w:r>
-      </w:ins>
-    </w:p>
-    <w:p>
-      <w:pPr>
-        <w:pStyle w:val="NormalWeb"/>
-      </w:pPr>
-      <w:ins w:id="16" w:author="sranjan@masonlive.gmu.edu" w:date="2025-11-11T11:36:00Z" w16du:dateUtc="2025-11-11T16:36:00Z">
-        <w:r>
-          <w:t>[Add text from the ethics approval and ethics reference number]</w:t>
-        </w:r>
-      </w:ins>
-    </w:p>
-    <w:p>
-      <w:pPr>
-        <w:pStyle w:val="NormalWeb"/>
-      </w:pPr>
-      <w:r>
-        <w:rPr>
-          <w:b/>
-          <w:bCs/>
-        </w:rPr>
-        <w:t>Q2.13</w:t>
-      </w:r>
-      <w:r>
-        <w:t xml:space="preserve"> </w:t>
-      </w:r>
-      <w:r>
-        <w:t>Clarify process for obtaining proxy consent and for post-recovery consent from previously unconscious participants, including time windows and how refusal would be handled for already collected data.</w:t>
-      </w:r>
-    </w:p>
-    <w:p>
-      <w:pPr>
-        <w:pStyle w:val="NormalWeb"/>
-      </w:pPr>
-      <w:r>
-        <w:rPr>
-          <w:b/>
-          <w:bCs/>
-        </w:rPr>
-        <w:t>R2.13</w:t>
-      </w:r>
-      <w:r>
-        <w:t xml:space="preserve"> </w:t>
-      </w:r>
-      <w:r>
-        <w:t>Participant consent is obtained by the designated CRC at each site, either from the participant or from the nearest kin, depending on the participant’s level of consciousness. If consent is obtained from the nearest kin, re-consent will be sought from the participant once they are in a condition to provide consent.</w:t>
+        <w:commentReference w:id="21"/>
+      </w:r>
+      <w:r>
+        <w:t>. If consent is obtained from the nearest kin, re-consent will be sought from the participant once they are in a condition to provide consent.</w:t>
       </w:r>
     </w:p>
     <w:p>
@@ -1115,7 +1761,7 @@
       <w:pPr>
         <w:pStyle w:val="NormalWeb"/>
         <w:rPr>
-          <w:ins w:id="17" w:author="sranjan@masonlive.gmu.edu" w:date="2025-11-11T11:42:00Z"/>
+          <w:ins w:id="22" w:author="sranjan@masonlive.gmu.edu" w:date="2025-11-11T11:42:00Z"/>
         </w:rPr>
       </w:pPr>
       <w:r>
@@ -1132,11 +1778,11 @@
       <w:r>
         <w:t xml:space="preserve">7) </w:t>
       </w:r>
-      <w:commentRangeStart w:id="18"/>
+      <w:commentRangeStart w:id="23"/>
       <w:r>
         <w:t>Adherence (fidelity) measurement</w:t>
       </w:r>
-      <w:commentRangeEnd w:id="18"/>
+      <w:commentRangeEnd w:id="23"/>
       <w:r>
         <w:rPr>
           <w:rStyle w:val="CommentReference"/>
@@ -1147,7 +1793,7 @@
           <w:lang w:val="en-US" w:eastAsia="en-US"/>
           <w14:ligatures w14:val="standardContextual"/>
         </w:rPr>
-        <w:commentReference w:id="18"/>
+        <w:commentReference w:id="23"/>
       </w:r>
     </w:p>
     <w:p>
@@ -1219,97 +1865,84 @@
           <w:b/>
           <w:bCs/>
         </w:rPr>
+        <w:t>Q2.15</w:t>
+      </w:r>
+      <w:r>
+        <w:t xml:space="preserve"> </w:t>
+      </w:r>
+      <w:r>
+        <w:t>State plans to minimise Hawthorne bias (e.g., discreet observation, sampling across shifts) and how missing adherence observations will be handled.</w:t>
+      </w:r>
+    </w:p>
+    <w:p>
+      <w:pPr>
+        <w:pStyle w:val="NormalWeb"/>
+      </w:pPr>
+      <w:r>
+        <w:rPr>
+          <w:b/>
+          <w:bCs/>
+        </w:rPr>
+        <w:t>R2.15</w:t>
+      </w:r>
+      <w:r>
+        <w:t xml:space="preserve"> The busy, crowded and noisy environment where the observations are taking place help limit </w:t>
+      </w:r>
+      <w:r>
+        <w:t>Hawthorne bias</w:t>
+      </w:r>
+      <w:r>
+        <w:t>. The nested staircase design and sampled shifts also helps in limiting this bias. Missing adherence observations will be handled as missing, and managed using the methods described under item 20c.</w:t>
+      </w:r>
+    </w:p>
+    <w:p>
+      <w:pPr>
+        <w:pStyle w:val="NormalWeb"/>
+      </w:pPr>
+      <w:r>
+        <w:t>8) Harms definition and reporting</w:t>
+      </w:r>
+    </w:p>
+    <w:p>
+      <w:pPr>
+        <w:pStyle w:val="NormalWeb"/>
+      </w:pPr>
+      <w:r>
+        <w:t>Issue: Protocol excludes routine AE/SAE reporting because events are common in critically ill patients but identifies a small set of "safety events". The approach risks underreporting intervention-related harms or unintended consequences (e.g., delays in care due to added tasks).</w:t>
+      </w:r>
+    </w:p>
+    <w:p>
+      <w:pPr>
+        <w:pStyle w:val="NormalWeb"/>
+      </w:pPr>
+      <w:r>
         <w:lastRenderedPageBreak/>
-        <w:t>Q2.15</w:t>
+        <w:t>Suggested actions:</w:t>
+      </w:r>
+    </w:p>
+    <w:p>
+      <w:pPr>
+        <w:pStyle w:val="NormalWeb"/>
+        <w:rPr>
+          <w:ins w:id="24" w:author="sranjan@masonlive.gmu.edu" w:date="2025-12-05T16:52:00Z" w16du:dateUtc="2025-12-05T21:52:00Z"/>
+        </w:rPr>
+      </w:pPr>
+      <w:r>
+        <w:rPr>
+          <w:b/>
+          <w:bCs/>
+        </w:rPr>
+        <w:t>Q2.16</w:t>
       </w:r>
       <w:r>
         <w:t xml:space="preserve"> </w:t>
       </w:r>
-      <w:r>
-        <w:t>State plans to minimise Hawthorne bias (e.g., discreet observation, sampling across shifts) and how missing adherence observations will be handled.</w:t>
-      </w:r>
-    </w:p>
-    <w:p>
-      <w:pPr>
-        <w:pStyle w:val="NormalWeb"/>
-      </w:pPr>
-      <w:r>
-        <w:rPr>
-          <w:b/>
-          <w:bCs/>
-        </w:rPr>
-        <w:t>R2.15</w:t>
-      </w:r>
-      <w:r>
-        <w:t xml:space="preserve"> The busy, crowded and noisy environment where the observations are taking place help limit </w:t>
-      </w:r>
-      <w:r>
-        <w:t>Hawthorne bias</w:t>
-      </w:r>
-      <w:r>
-        <w:t xml:space="preserve">. The nested staircase design and sampled shifts also helps in limiting this bias. Missing adherence observations will be handled as </w:t>
-      </w:r>
-      <w:proofErr w:type="gramStart"/>
-      <w:r>
-        <w:t>missing, and</w:t>
-      </w:r>
-      <w:proofErr w:type="gramEnd"/>
-      <w:r>
-        <w:t xml:space="preserve"> managed using the methods described under item 20c.</w:t>
-      </w:r>
-    </w:p>
-    <w:p>
-      <w:pPr>
-        <w:pStyle w:val="NormalWeb"/>
-      </w:pPr>
-      <w:r>
-        <w:t>8) Harms definition and reporting</w:t>
-      </w:r>
-    </w:p>
-    <w:p>
-      <w:pPr>
-        <w:pStyle w:val="NormalWeb"/>
-      </w:pPr>
-      <w:r>
-        <w:t>Issue: Protocol excludes routine AE/SAE reporting because events are common in critically ill patients but identifies a small set of "safety events". The approach risks underreporting intervention-related harms or unintended consequences (e.g., delays in care due to added tasks).</w:t>
-      </w:r>
-    </w:p>
-    <w:p>
-      <w:pPr>
-        <w:pStyle w:val="NormalWeb"/>
-      </w:pPr>
-      <w:r>
-        <w:t>Suggested actions:</w:t>
-      </w:r>
-    </w:p>
-    <w:p>
-      <w:pPr>
-        <w:pStyle w:val="NormalWeb"/>
-      </w:pPr>
-      <w:r>
-        <w:rPr>
-          <w:b/>
-          <w:bCs/>
-        </w:rPr>
-        <w:t>Q2.16</w:t>
-      </w:r>
-      <w:r>
-        <w:t xml:space="preserve"> </w:t>
-      </w:r>
-      <w:commentRangeStart w:id="19"/>
-      <w:commentRangeStart w:id="20"/>
-      <w:r>
-        <w:t xml:space="preserve">Define a more comprehensive, preplanned list or criteria for safety signal detection beyond the three items </w:t>
-      </w:r>
-      <w:proofErr w:type="gramStart"/>
-      <w:r>
-        <w:t>listed, and</w:t>
-      </w:r>
-      <w:proofErr w:type="gramEnd"/>
-      <w:r>
-        <w:t xml:space="preserve"> specify how increases will be assessed (statistically vs. clinically). Clarify </w:t>
-      </w:r>
-      <w:commentRangeEnd w:id="19"/>
+      <w:commentRangeStart w:id="25"/>
+      <w:commentRangeStart w:id="26"/>
+      <w:r>
+        <w:t xml:space="preserve">Define a more comprehensive, preplanned list or criteria for safety signal detection beyond the three items listed, and specify how increases will be assessed (statistically vs. clinically). Clarify </w:t>
+      </w:r>
+      <w:commentRangeEnd w:id="25"/>
       <w:r>
         <w:rPr>
           <w:rStyle w:val="CommentReference"/>
@@ -1320,9 +1953,9 @@
           <w:lang w:val="en-US" w:eastAsia="en-US"/>
           <w14:ligatures w14:val="standardContextual"/>
         </w:rPr>
-        <w:commentReference w:id="19"/>
-      </w:r>
-      <w:commentRangeEnd w:id="20"/>
+        <w:commentReference w:id="25"/>
+      </w:r>
+      <w:commentRangeEnd w:id="26"/>
       <w:r>
         <w:rPr>
           <w:rStyle w:val="CommentReference"/>
@@ -1333,13 +1966,14 @@
           <w:lang w:val="en-US" w:eastAsia="en-US"/>
           <w14:ligatures w14:val="standardContextual"/>
         </w:rPr>
-        <w:commentReference w:id="20"/>
-      </w:r>
-      <w:commentRangeStart w:id="21"/>
+        <w:commentReference w:id="26"/>
+      </w:r>
+      <w:commentRangeStart w:id="27"/>
+      <w:commentRangeStart w:id="28"/>
       <w:r>
         <w:t>reporting timelines and responsibilities.</w:t>
       </w:r>
-      <w:commentRangeEnd w:id="21"/>
+      <w:commentRangeEnd w:id="27"/>
       <w:r>
         <w:rPr>
           <w:rStyle w:val="CommentReference"/>
@@ -1350,7 +1984,14 @@
           <w:lang w:val="en-US" w:eastAsia="en-US"/>
           <w14:ligatures w14:val="standardContextual"/>
         </w:rPr>
-        <w:commentReference w:id="21"/>
+        <w:commentReference w:id="27"/>
+      </w:r>
+      <w:commentRangeEnd w:id="28"/>
+      <w:r>
+        <w:rPr>
+          <w:rStyle w:val="CommentReference"/>
+        </w:rPr>
+        <w:commentReference w:id="28"/>
       </w:r>
     </w:p>
     <w:p>
@@ -1380,23 +2021,7 @@
       </w:r>
       <w:proofErr w:type="gramEnd"/>
       <w:r>
-        <w:t xml:space="preserve"> safety signals and the investigators assessments of these as the basis for our safety monitoring. The CRCs or site investigators initiate the safety </w:t>
-      </w:r>
-      <w:proofErr w:type="gramStart"/>
-      <w:r>
-        <w:t>reporting</w:t>
-      </w:r>
-      <w:proofErr w:type="gramEnd"/>
-      <w:r>
-        <w:t xml:space="preserve"> and the site investigator is responsible for making a first assessment of whether the event is likely to be associated with the patient’s condition or the trial procedure. If the event is assessed as associated with the trial, then the event is reviewed by the trial management group and then by the steering and data monitoring committee. Each instance has 24-48 hours to make this assessment. Regarding delays in </w:t>
-      </w:r>
-      <w:proofErr w:type="gramStart"/>
-      <w:r>
-        <w:t>care</w:t>
-      </w:r>
-      <w:proofErr w:type="gramEnd"/>
-      <w:r>
-        <w:t xml:space="preserve"> we are collecting emergency department length of stay as a secondary outcome and will thus be able to assess potential delays that result in a longer stay in the emergency department.</w:t>
+        <w:t xml:space="preserve"> safety signals and the investigators assessments of these as the basis for our safety monitoring. The CRCs or site investigators initiate the safety reporting and the site investigator is responsible for making a first assessment of whether the event is likely to be associated with the patient’s condition or the trial procedure. If the event is assessed as associated with the trial, then the event is reviewed by the trial management group and then by the steering and data monitoring committee. Each instance has 24-48 hours to make this assessment. Regarding delays in care we are collecting emergency department length of stay as a secondary outcome and will thus be able to assess potential delays that result in a longer stay in the emergency department.</w:t>
       </w:r>
     </w:p>
     <w:p>
@@ -1458,10 +2083,7 @@
         <w:t xml:space="preserve"> </w:t>
       </w:r>
       <w:r>
-        <w:t xml:space="preserve">Trial dates and registration: Include trial registration numbers and registration dates in the abstract (you list CTRI and ClinicalTrials.gov in the document; ensure both IDs and dates </w:t>
-      </w:r>
-      <w:r>
-        <w:t>are present in abstract and the journal's required format).</w:t>
+        <w:t>Trial dates and registration: Include trial registration numbers and registration dates in the abstract (you list CTRI and ClinicalTrials.gov in the document; ensure both IDs and dates are present in abstract and the journal's required format).</w:t>
       </w:r>
     </w:p>
     <w:p>
@@ -1491,7 +2113,6 @@
           <w:b/>
           <w:bCs/>
         </w:rPr>
-        <w:lastRenderedPageBreak/>
         <w:t>Q2.19</w:t>
       </w:r>
       <w:r>
@@ -1579,11 +2200,11 @@
       <w:r>
         <w:t xml:space="preserve"> </w:t>
       </w:r>
-      <w:commentRangeStart w:id="22"/>
+      <w:commentRangeStart w:id="29"/>
       <w:r>
         <w:t>Competing</w:t>
       </w:r>
-      <w:commentRangeEnd w:id="22"/>
+      <w:commentRangeEnd w:id="29"/>
       <w:r>
         <w:rPr>
           <w:rStyle w:val="CommentReference"/>
@@ -1594,7 +2215,7 @@
           <w:lang w:val="en-US" w:eastAsia="en-US"/>
           <w14:ligatures w14:val="standardContextual"/>
         </w:rPr>
-        <w:commentReference w:id="22"/>
+        <w:commentReference w:id="29"/>
       </w:r>
       <w:r>
         <w:t xml:space="preserve"> interests: Several contributors are ATLS® instructors — consider describing mitigation (e.g., independent data analysis, sponsor non-involvement).</w:t>
@@ -1609,6 +2230,7 @@
           <w:b/>
           <w:bCs/>
         </w:rPr>
+        <w:lastRenderedPageBreak/>
         <w:t>R2.21</w:t>
       </w:r>
       <w:r>
@@ -1645,15 +2267,7 @@
         <w:t xml:space="preserve"> </w:t>
       </w:r>
       <w:r>
-        <w:t>Grammar / small edits: A light copy edit is needed for typos and phrasing (e.g., "</w:t>
-      </w:r>
-      <w:proofErr w:type="gramStart"/>
-      <w:r>
-        <w:t>Thee</w:t>
-      </w:r>
-      <w:proofErr w:type="gramEnd"/>
-      <w:r>
-        <w:t xml:space="preserve"> are mainly" → "There are mainly"; consistent use of ATLS® trademark format).</w:t>
+        <w:t>Grammar / small edits: A light copy edit is needed for typos and phrasing (e.g., "Thee are mainly" → "There are mainly"; consistent use of ATLS® trademark format).</w:t>
       </w:r>
     </w:p>
     <w:p>
@@ -1712,8 +2326,11 @@
       </w:r>
     </w:p>
   </w:comment>
-  <w:comment w:id="2" w:author="sranjan@masonlive.gmu.edu" w:date="2025-11-11T10:47:00Z" w:initials="SR">
-    <w:p>
+  <w:comment w:id="2" w:author="Prashant Kharat" w:date="2025-11-27T12:20:00Z" w:initials="PK">
+    <w:p>
+      <w:pPr>
+        <w:pStyle w:val="CommentText"/>
+      </w:pPr>
       <w:r>
         <w:rPr>
           <w:rStyle w:val="CommentReference"/>
@@ -1721,11 +2338,11 @@
         <w:annotationRef/>
       </w:r>
       <w:r>
-        <w:t xml:space="preserve">@Martin, this requires input from the stats team. </w:t>
+        <w:t xml:space="preserve">By Day 30, at least three to four phone calls will be attempted. Depending on the response, a subsequent telephone follow-up will be scheduled. If there is no response, the case will be marked as “lost to follow-up. </w:t>
       </w:r>
     </w:p>
   </w:comment>
-  <w:comment w:id="3" w:author="Martin Gerdin Wärnberg" w:date="2025-11-22T05:26:00Z" w:initials="MG">
+  <w:comment w:id="3" w:author="sranjan@masonlive.gmu.edu" w:date="2025-12-05T16:40:00Z" w:initials="SR">
     <w:p>
       <w:r>
         <w:rPr>
@@ -1738,12 +2355,15 @@
           <w:sz w:val="20"/>
           <w:szCs w:val="18"/>
         </w:rPr>
-        <w:t>Suggested response added, based on the statistical analysis plan.</w:t>
+        <w:t>text added</w:t>
       </w:r>
     </w:p>
   </w:comment>
-  <w:comment w:id="4" w:author="sranjan@masonlive.gmu.edu" w:date="2025-11-11T12:45:00Z" w:initials="SR">
-    <w:p>
+  <w:comment w:id="4" w:author="Monty Khajanchi" w:date="2025-11-27T05:12:00Z" w:initials="MK">
+    <w:p>
+      <w:pPr>
+        <w:pStyle w:val="CommentText"/>
+      </w:pPr>
       <w:r>
         <w:rPr>
           <w:rStyle w:val="CommentReference"/>
@@ -1751,11 +2371,27 @@
         <w:annotationRef/>
       </w:r>
       <w:r>
-        <w:t>Stats team to comment</w:t>
+        <w:rPr>
+          <w:lang w:val="en-IN"/>
+        </w:rPr>
+        <w:t xml:space="preserve">Should we add the frequency of calls (once a week/twice a week) for transferred patients disposition (death/discharge). There will be some diff. asc. bias as they are not under the same hospital. </w:t>
       </w:r>
     </w:p>
   </w:comment>
-  <w:comment w:id="5" w:author="Martin Gerdin Wärnberg" w:date="2025-11-22T05:43:00Z" w:initials="MG">
+  <w:comment w:id="5" w:author="sranjan@masonlive.gmu.edu" w:date="2025-11-11T10:47:00Z" w:initials="SR">
+    <w:p>
+      <w:r>
+        <w:rPr>
+          <w:rStyle w:val="CommentReference"/>
+        </w:rPr>
+        <w:annotationRef/>
+      </w:r>
+      <w:r>
+        <w:t xml:space="preserve">@Martin, this requires input from the stats team. </w:t>
+      </w:r>
+    </w:p>
+  </w:comment>
+  <w:comment w:id="6" w:author="Martin Gerdin Wärnberg" w:date="2025-11-22T05:26:00Z" w:initials="MG">
     <w:p>
       <w:r>
         <w:rPr>
@@ -1768,11 +2404,24 @@
           <w:sz w:val="20"/>
           <w:szCs w:val="18"/>
         </w:rPr>
-        <w:t>@prashant, please verify that this is correct.</w:t>
+        <w:t>Suggested response added, based on the statistical analysis plan.</w:t>
       </w:r>
     </w:p>
   </w:comment>
-  <w:comment w:id="6" w:author="Martin Gerdin Wärnberg" w:date="2025-11-22T05:44:00Z" w:initials="MG">
+  <w:comment w:id="7" w:author="sranjan@masonlive.gmu.edu" w:date="2025-11-11T12:45:00Z" w:initials="SR">
+    <w:p>
+      <w:r>
+        <w:rPr>
+          <w:rStyle w:val="CommentReference"/>
+        </w:rPr>
+        <w:annotationRef/>
+      </w:r>
+      <w:r>
+        <w:t>Stats team to comment</w:t>
+      </w:r>
+    </w:p>
+  </w:comment>
+  <w:comment w:id="8" w:author="Martin Gerdin Wärnberg" w:date="2025-11-22T05:43:00Z" w:initials="MG">
     <w:p>
       <w:r>
         <w:rPr>
@@ -1785,12 +2434,15 @@
           <w:sz w:val="20"/>
           <w:szCs w:val="18"/>
         </w:rPr>
-        <w:t>Needs to be discussed further.</w:t>
+        <w:t>@prashant, please verify that this is correct.</w:t>
       </w:r>
     </w:p>
   </w:comment>
-  <w:comment w:id="7" w:author="sranjan@masonlive.gmu.edu" w:date="2025-11-11T12:46:00Z" w:initials="SR">
-    <w:p>
+  <w:comment w:id="9" w:author="Prashant Kharat" w:date="2025-11-27T12:20:00Z" w:initials="PK">
+    <w:p>
+      <w:pPr>
+        <w:pStyle w:val="CommentText"/>
+      </w:pPr>
       <w:r>
         <w:rPr>
           <w:rStyle w:val="CommentReference"/>
@@ -1798,63 +2450,11 @@
         <w:annotationRef/>
       </w:r>
       <w:r>
-        <w:t>stats team to answer</w:t>
+        <w:t xml:space="preserve">If the death occurs in hospital, we review 100% of the source data. If the death happens after discharge, we attempt to determine the cause of mortality. </w:t>
       </w:r>
     </w:p>
   </w:comment>
-  <w:comment w:id="8" w:author="sranjan@masonlive.gmu.edu" w:date="2025-11-11T10:51:00Z" w:initials="SR">
-    <w:p>
-      <w:r>
-        <w:rPr>
-          <w:rStyle w:val="CommentReference"/>
-        </w:rPr>
-        <w:annotationRef/>
-      </w:r>
-      <w:r>
-        <w:t>Probably stats team can provide answer on these.</w:t>
-      </w:r>
-    </w:p>
-  </w:comment>
-  <w:comment w:id="9" w:author="sranjan@masonlive.gmu.edu" w:date="2025-11-11T10:56:00Z" w:initials="SR">
-    <w:p>
-      <w:r>
-        <w:rPr>
-          <w:rStyle w:val="CommentReference"/>
-        </w:rPr>
-        <w:annotationRef/>
-      </w:r>
-      <w:r>
-        <w:t>I remember in the last steering committee meeting there were certain discussion on the interim analysis. Not sure, if it covers all the details mentioned here. @Martin, could you please address this.</w:t>
-      </w:r>
-    </w:p>
-  </w:comment>
-  <w:comment w:id="10" w:author="sranjan@masonlive.gmu.edu" w:date="2025-11-11T10:58:00Z" w:initials="SR">
-    <w:p>
-      <w:r>
-        <w:rPr>
-          <w:rStyle w:val="CommentReference"/>
-        </w:rPr>
-        <w:annotationRef/>
-      </w:r>
-      <w:r>
-        <w:t>@Prashant to add, the content from Informed consent document for opt-out consent. Also, the ethics approval number.</w:t>
-      </w:r>
-    </w:p>
-  </w:comment>
-  <w:comment w:id="11" w:author="sranjan@masonlive.gmu.edu" w:date="2025-11-11T11:33:00Z" w:initials="SR">
-    <w:p>
-      <w:r>
-        <w:rPr>
-          <w:rStyle w:val="CommentReference"/>
-        </w:rPr>
-        <w:annotationRef/>
-      </w:r>
-      <w:r>
-        <w:t>Will paraphrase, once the text is added.</w:t>
-      </w:r>
-    </w:p>
-  </w:comment>
-  <w:comment w:id="13" w:author="Martin Gerdin Wärnberg" w:date="2025-11-22T05:59:00Z" w:initials="MG">
+  <w:comment w:id="10" w:author="sranjan@masonlive.gmu.edu" w:date="2025-12-05T16:43:00Z" w:initials="SR">
     <w:p>
       <w:r>
         <w:rPr>
@@ -1867,12 +2467,24 @@
           <w:sz w:val="20"/>
           <w:szCs w:val="18"/>
         </w:rPr>
-        <w:t>@prashant, please summarise the information provided to the participants regarding the opt-out consent.</w:t>
+        <w:t>@Added</w:t>
+      </w:r>
+    </w:p>
+    <w:p>
+      <w:r>
+        <w:rPr>
+          <w:sz w:val="20"/>
+          <w:szCs w:val="18"/>
+        </w:rPr>
+        <w:t>Not sure about the other paragraph Martin. I think its not required.</w:t>
       </w:r>
     </w:p>
   </w:comment>
-  <w:comment w:id="18" w:author="sranjan@masonlive.gmu.edu" w:date="2025-11-11T11:43:00Z" w:initials="SR">
-    <w:p>
+  <w:comment w:id="13" w:author="Monty Khajanchi" w:date="2025-11-27T05:22:00Z" w:initials="MK">
+    <w:p>
+      <w:pPr>
+        <w:pStyle w:val="CommentText"/>
+      </w:pPr>
       <w:r>
         <w:rPr>
           <w:rStyle w:val="CommentReference"/>
@@ -1880,11 +2492,127 @@
         <w:annotationRef/>
       </w:r>
       <w:r>
+        <w:rPr>
+          <w:lang w:val="en-IN"/>
+        </w:rPr>
+        <w:t xml:space="preserve">I think we have definitions for ICU and length of stay. We should highlight that too here. </w:t>
+      </w:r>
+    </w:p>
+  </w:comment>
+  <w:comment w:id="14" w:author="sranjan@masonlive.gmu.edu" w:date="2025-11-11T12:46:00Z" w:initials="SR">
+    <w:p>
+      <w:r>
+        <w:rPr>
+          <w:rStyle w:val="CommentReference"/>
+        </w:rPr>
+        <w:annotationRef/>
+      </w:r>
+      <w:r>
+        <w:t>stats team to answer</w:t>
+      </w:r>
+    </w:p>
+  </w:comment>
+  <w:comment w:id="16" w:author="sranjan@masonlive.gmu.edu" w:date="2025-11-11T10:51:00Z" w:initials="SR">
+    <w:p>
+      <w:r>
+        <w:rPr>
+          <w:rStyle w:val="CommentReference"/>
+        </w:rPr>
+        <w:annotationRef/>
+      </w:r>
+      <w:r>
+        <w:t>Probably stats team can provide answer on these.</w:t>
+      </w:r>
+    </w:p>
+  </w:comment>
+  <w:comment w:id="17" w:author="Jessica Kasza" w:date="2025-12-01T13:28:00Z" w:initials="JK">
+    <w:p>
+      <w:pPr>
+        <w:pStyle w:val="CommentText"/>
+      </w:pPr>
+      <w:r>
+        <w:rPr>
+          <w:rStyle w:val="CommentReference"/>
+        </w:rPr>
+        <w:annotationRef/>
+      </w:r>
+      <w:r>
+        <w:t>Here I recommend re-stating that period effects will be adjusted for in all models and this will account for secular trends. It will be assumed that there is no informative cluster size.</w:t>
+      </w:r>
+    </w:p>
+  </w:comment>
+  <w:comment w:id="18" w:author="sranjan@masonlive.gmu.edu" w:date="2025-11-11T10:56:00Z" w:initials="SR">
+    <w:p>
+      <w:r>
+        <w:rPr>
+          <w:rStyle w:val="CommentReference"/>
+        </w:rPr>
+        <w:annotationRef/>
+      </w:r>
+      <w:r>
+        <w:t>I remember in the last steering committee meeting there were certain discussion on the interim analysis. Not sure, if it covers all the details mentioned here. @Martin, could you please address this.</w:t>
+      </w:r>
+    </w:p>
+  </w:comment>
+  <w:comment w:id="19" w:author="sranjan@masonlive.gmu.edu" w:date="2025-11-11T10:58:00Z" w:initials="SR">
+    <w:p>
+      <w:r>
+        <w:rPr>
+          <w:rStyle w:val="CommentReference"/>
+        </w:rPr>
+        <w:annotationRef/>
+      </w:r>
+      <w:r>
+        <w:t>@Prashant to add, the content from Informed consent document for opt-out consent. Also, the ethics approval number.</w:t>
+      </w:r>
+    </w:p>
+  </w:comment>
+  <w:comment w:id="20" w:author="sranjan@masonlive.gmu.edu" w:date="2025-11-11T11:33:00Z" w:initials="SR">
+    <w:p>
+      <w:r>
+        <w:rPr>
+          <w:rStyle w:val="CommentReference"/>
+        </w:rPr>
+        <w:annotationRef/>
+      </w:r>
+      <w:r>
+        <w:t>Will paraphrase, once the text is added.</w:t>
+      </w:r>
+    </w:p>
+  </w:comment>
+  <w:comment w:id="21" w:author="Monty Khajanchi" w:date="2025-11-27T05:43:00Z" w:initials="MK">
+    <w:p>
+      <w:pPr>
+        <w:pStyle w:val="CommentText"/>
+      </w:pPr>
+      <w:r>
+        <w:rPr>
+          <w:rStyle w:val="CommentReference"/>
+        </w:rPr>
+        <w:annotationRef/>
+      </w:r>
+      <w:r>
+        <w:rPr>
+          <w:lang w:val="en-IN"/>
+        </w:rPr>
+        <w:t xml:space="preserve">We mention the time of the first consent- After we screen and find patient eligible in the ER for inclusion in the study we take consent from the participant or the nearest kin, before recording any variable. </w:t>
+      </w:r>
+    </w:p>
+  </w:comment>
+  <w:comment w:id="23" w:author="sranjan@masonlive.gmu.edu" w:date="2025-11-11T11:43:00Z" w:initials="SR">
+    <w:p>
+      <w:r>
+        <w:rPr>
+          <w:rStyle w:val="CommentReference"/>
+        </w:rPr>
+        <w:annotationRef/>
+      </w:r>
+      <w:r>
         <w:t>@Martin, stats team can probably answer this better</w:t>
       </w:r>
     </w:p>
   </w:comment>
-  <w:comment w:id="19" w:author="sranjan@masonlive.gmu.edu" w:date="2025-11-11T11:50:00Z" w:initials="SR">
+  <w:comment w:id="25" w:author="sranjan@masonlive.gmu.edu" w:date="2025-11-11T11:50:00Z" w:initials="SR">
     <w:p>
       <w:r>
         <w:rPr>
@@ -1897,7 +2625,7 @@
       </w:r>
     </w:p>
   </w:comment>
-  <w:comment w:id="20" w:author="sranjan@masonlive.gmu.edu" w:date="2025-11-11T11:50:00Z" w:initials="SR">
+  <w:comment w:id="26" w:author="sranjan@masonlive.gmu.edu" w:date="2025-11-11T11:50:00Z" w:initials="SR">
     <w:p>
       <w:r>
         <w:rPr>
@@ -1910,7 +2638,7 @@
       </w:r>
     </w:p>
   </w:comment>
-  <w:comment w:id="21" w:author="sranjan@masonlive.gmu.edu" w:date="2025-11-11T11:53:00Z" w:initials="SR">
+  <w:comment w:id="27" w:author="sranjan@masonlive.gmu.edu" w:date="2025-11-11T11:53:00Z" w:initials="SR">
     <w:p>
       <w:r>
         <w:rPr>
@@ -1923,7 +2651,764 @@
       </w:r>
     </w:p>
   </w:comment>
-  <w:comment w:id="22" w:author="sranjan@masonlive.gmu.edu" w:date="2025-11-11T12:40:00Z" w:initials="SR">
+  <w:comment w:id="28" w:author="Prashant Kharat" w:date="2025-11-27T12:23:00Z" w:initials="PK">
+    <w:p>
+      <w:pPr>
+        <w:pStyle w:val="CommentText"/>
+      </w:pPr>
+      <w:r>
+        <w:rPr>
+          <w:rStyle w:val="CommentReference"/>
+        </w:rPr>
+        <w:annotationRef/>
+      </w:r>
+      <w:r>
+        <w:rPr>
+          <w:highlight w:val="yellow"/>
+          <w:lang w:val="en-IN"/>
+        </w:rPr>
+        <w:t>This trial will not collect adverse events or serious adverse events. Only the enlisted events will be documented as safety events. Safety events to be tracked both in standard care and in intervention phase. Any other safety events that are identified by the clinical research coordinators or local investigators during the trial will also be reported. This may include missed injuries or missed investigations, which could be suspected if certain injuries or investigations are identified during the intervention phase.  </w:t>
+      </w:r>
+    </w:p>
+    <w:p>
+      <w:pPr>
+        <w:pStyle w:val="CommentText"/>
+      </w:pPr>
+      <w:r>
+        <w:rPr>
+          <w:highlight w:val="yellow"/>
+          <w:lang w:val="en-IN"/>
+        </w:rPr>
+        <w:t>The safety events will include following: </w:t>
+      </w:r>
+    </w:p>
+    <w:p>
+      <w:pPr>
+        <w:pStyle w:val="CommentText"/>
+        <w:numPr>
+          <w:ilvl w:val="0"/>
+          <w:numId w:val="3"/>
+        </w:numPr>
+      </w:pPr>
+      <w:r>
+        <w:rPr>
+          <w:highlight w:val="yellow"/>
+          <w:lang w:val="en-IN"/>
+        </w:rPr>
+        <w:t>There is a life-threatening condition  </w:t>
+      </w:r>
+    </w:p>
+    <w:p>
+      <w:pPr>
+        <w:pStyle w:val="CommentText"/>
+        <w:numPr>
+          <w:ilvl w:val="0"/>
+          <w:numId w:val="3"/>
+        </w:numPr>
+      </w:pPr>
+      <w:r>
+        <w:rPr>
+          <w:highlight w:val="yellow"/>
+          <w:lang w:val="en-IN"/>
+        </w:rPr>
+        <w:t>Prolong hospitalization </w:t>
+      </w:r>
+    </w:p>
+    <w:p>
+      <w:pPr>
+        <w:pStyle w:val="CommentText"/>
+        <w:numPr>
+          <w:ilvl w:val="0"/>
+          <w:numId w:val="3"/>
+        </w:numPr>
+      </w:pPr>
+      <w:r>
+        <w:rPr>
+          <w:highlight w:val="yellow"/>
+          <w:lang w:val="en-IN"/>
+        </w:rPr>
+        <w:t>Result in meaningful harm to the participant </w:t>
+      </w:r>
+    </w:p>
+    <w:p>
+      <w:pPr>
+        <w:pStyle w:val="CommentText"/>
+        <w:numPr>
+          <w:ilvl w:val="0"/>
+          <w:numId w:val="3"/>
+        </w:numPr>
+      </w:pPr>
+      <w:r>
+        <w:rPr>
+          <w:highlight w:val="yellow"/>
+          <w:lang w:val="en-IN"/>
+        </w:rPr>
+        <w:t>Prolonged mechanical ventilation (&gt; 7 days) </w:t>
+      </w:r>
+    </w:p>
+    <w:p>
+      <w:pPr>
+        <w:pStyle w:val="CommentText"/>
+        <w:numPr>
+          <w:ilvl w:val="0"/>
+          <w:numId w:val="3"/>
+        </w:numPr>
+      </w:pPr>
+      <w:r>
+        <w:rPr>
+          <w:highlight w:val="yellow"/>
+          <w:lang w:val="en-IN"/>
+        </w:rPr>
+        <w:t>Initiation of renal replacement therapy </w:t>
+      </w:r>
+    </w:p>
+    <w:p>
+      <w:pPr>
+        <w:pStyle w:val="CommentText"/>
+        <w:numPr>
+          <w:ilvl w:val="0"/>
+          <w:numId w:val="3"/>
+        </w:numPr>
+      </w:pPr>
+      <w:r>
+        <w:rPr>
+          <w:highlight w:val="yellow"/>
+          <w:lang w:val="en-IN"/>
+        </w:rPr>
+        <w:t>Prolonged (&gt; 2 days) or renewed (restart after at least 2 days without) use of </w:t>
+      </w:r>
+    </w:p>
+    <w:p>
+      <w:pPr>
+        <w:pStyle w:val="CommentText"/>
+      </w:pPr>
+      <w:r>
+        <w:rPr>
+          <w:highlight w:val="yellow"/>
+          <w:lang w:val="en-IN"/>
+        </w:rPr>
+        <w:t>All safety events will be recorded in the Case Record Form (CRF). It will be the responsibility of the PI assess the safety event and</w:t>
+      </w:r>
+      <w:r>
+        <w:rPr>
+          <w:b/>
+          <w:bCs/>
+          <w:highlight w:val="yellow"/>
+          <w:lang w:val="en-IN"/>
+        </w:rPr>
+        <w:t xml:space="preserve"> </w:t>
+      </w:r>
+      <w:r>
+        <w:rPr>
+          <w:highlight w:val="yellow"/>
+          <w:lang w:val="en-IN"/>
+        </w:rPr>
+        <w:t xml:space="preserve">to report the event to </w:t>
+      </w:r>
+      <w:r>
+        <w:rPr>
+          <w:b/>
+          <w:bCs/>
+          <w:highlight w:val="yellow"/>
+          <w:lang w:val="en-IN"/>
+        </w:rPr>
+        <w:t>TMG within 24 hours</w:t>
+      </w:r>
+      <w:r>
+        <w:rPr>
+          <w:highlight w:val="yellow"/>
+          <w:lang w:val="en-IN"/>
+        </w:rPr>
+        <w:t xml:space="preserve"> of its occurrence by the site via email. The recorded CRF will be shared with the TMG via email by site PI. The TMG will then assess if the event can be considered related to the trial or the intervention </w:t>
+      </w:r>
+      <w:r>
+        <w:rPr>
+          <w:b/>
+          <w:bCs/>
+          <w:highlight w:val="yellow"/>
+          <w:lang w:val="en-IN"/>
+        </w:rPr>
+        <w:t xml:space="preserve">within 24 hours </w:t>
+      </w:r>
+      <w:r>
+        <w:rPr>
+          <w:highlight w:val="yellow"/>
+          <w:lang w:val="en-IN"/>
+        </w:rPr>
+        <w:t xml:space="preserve">of it being reported. Events that are considered probably related will be reported immediately to the Trial Steering and Data Monitoring Committee (SDMC) via email </w:t>
+      </w:r>
+      <w:r>
+        <w:rPr>
+          <w:b/>
+          <w:bCs/>
+          <w:highlight w:val="yellow"/>
+          <w:lang w:val="en-IN"/>
+        </w:rPr>
+        <w:t>within 5 working days</w:t>
+      </w:r>
+      <w:r>
+        <w:rPr>
+          <w:highlight w:val="yellow"/>
+          <w:lang w:val="en-IN"/>
+        </w:rPr>
+        <w:t xml:space="preserve"> via an email. </w:t>
+      </w:r>
+      <w:r>
+        <w:rPr>
+          <w:b/>
+          <w:bCs/>
+          <w:highlight w:val="yellow"/>
+          <w:lang w:val="en-IN"/>
+        </w:rPr>
+        <w:t>Box 1</w:t>
+      </w:r>
+      <w:r>
+        <w:rPr>
+          <w:highlight w:val="yellow"/>
+          <w:lang w:val="en-IN"/>
+        </w:rPr>
+        <w:t xml:space="preserve"> contains the details of the email to be shared to the TMG. Along with this it is the responsibility of the respective site to inform their IEC as per the requirements by the ethics.  </w:t>
+      </w:r>
+    </w:p>
+    <w:p>
+      <w:pPr>
+        <w:pStyle w:val="CommentText"/>
+      </w:pPr>
+      <w:r>
+        <w:rPr>
+          <w:b/>
+          <w:bCs/>
+          <w:highlight w:val="yellow"/>
+          <w:lang w:val="en-IN"/>
+        </w:rPr>
+        <w:t>Box 1: Email template</w:t>
+      </w:r>
+      <w:r>
+        <w:rPr>
+          <w:highlight w:val="yellow"/>
+          <w:lang w:val="en-IN"/>
+        </w:rPr>
+        <w:t> </w:t>
+      </w:r>
+    </w:p>
+    <w:p>
+      <w:pPr>
+        <w:pStyle w:val="CommentText"/>
+      </w:pPr>
+      <w:r>
+        <w:rPr>
+          <w:highlight w:val="yellow"/>
+          <w:lang w:val="en-IN"/>
+        </w:rPr>
+        <w:t>From: Site PI email/designated staff email </w:t>
+      </w:r>
+    </w:p>
+    <w:p>
+      <w:pPr>
+        <w:pStyle w:val="CommentText"/>
+      </w:pPr>
+      <w:r>
+        <w:rPr>
+          <w:highlight w:val="yellow"/>
+          <w:lang w:val="en-IN"/>
+        </w:rPr>
+        <w:t>To: TMG  </w:t>
+      </w:r>
+    </w:p>
+    <w:p>
+      <w:pPr>
+        <w:pStyle w:val="CommentText"/>
+      </w:pPr>
+      <w:r>
+        <w:rPr>
+          <w:highlight w:val="yellow"/>
+          <w:lang w:val="en-IN"/>
+        </w:rPr>
+        <w:t>Subject: Safety reporting from &lt;Site Name&gt; and &lt;Participant ID&gt; </w:t>
+      </w:r>
+    </w:p>
+    <w:p>
+      <w:pPr>
+        <w:pStyle w:val="CommentText"/>
+      </w:pPr>
+      <w:r>
+        <w:rPr>
+          <w:highlight w:val="yellow"/>
+          <w:lang w:val="en-IN"/>
+        </w:rPr>
+        <w:t>Dear Sir/Madam, </w:t>
+      </w:r>
+    </w:p>
+    <w:p>
+      <w:pPr>
+        <w:pStyle w:val="CommentText"/>
+      </w:pPr>
+      <w:r>
+        <w:rPr>
+          <w:highlight w:val="yellow"/>
+          <w:lang w:val="en-IN"/>
+        </w:rPr>
+        <w:t xml:space="preserve">This is to notify that patient participant with ID in the Advance trauma trial aged &lt;xx&gt; years, male/female. The event happened on &lt;DD/MM/YYYY&gt; and came to our knowledge on &lt;DD/MM/YYYY, xx:xx AM/PM&gt;. The Safety Event Form </w:t>
+      </w:r>
+      <w:r>
+        <w:rPr>
+          <w:b/>
+          <w:bCs/>
+          <w:highlight w:val="yellow"/>
+        </w:rPr>
+        <w:t xml:space="preserve">V1.0.01.10.24 </w:t>
+      </w:r>
+      <w:r>
+        <w:rPr>
+          <w:highlight w:val="yellow"/>
+          <w:lang w:val="en-IN"/>
+        </w:rPr>
+        <w:t>have been enclosed in the email with Investigator assessment of safety event. </w:t>
+      </w:r>
+    </w:p>
+    <w:p>
+      <w:pPr>
+        <w:pStyle w:val="CommentText"/>
+      </w:pPr>
+      <w:r>
+        <w:rPr>
+          <w:highlight w:val="yellow"/>
+          <w:lang w:val="en-IN"/>
+        </w:rPr>
+        <w:t> </w:t>
+      </w:r>
+    </w:p>
+    <w:p>
+      <w:pPr>
+        <w:pStyle w:val="CommentText"/>
+      </w:pPr>
+      <w:r>
+        <w:rPr>
+          <w:highlight w:val="yellow"/>
+          <w:lang w:val="en-IN"/>
+        </w:rPr>
+        <w:t>Regards </w:t>
+      </w:r>
+    </w:p>
+    <w:p>
+      <w:pPr>
+        <w:pStyle w:val="CommentText"/>
+      </w:pPr>
+      <w:r>
+        <w:rPr>
+          <w:highlight w:val="yellow"/>
+          <w:lang w:val="en-IN"/>
+        </w:rPr>
+        <w:t>[Site investigator/or designated research staff on behalf of PI Hospital name] </w:t>
+      </w:r>
+    </w:p>
+    <w:p>
+      <w:pPr>
+        <w:pStyle w:val="CommentText"/>
+        <w:numPr>
+          <w:ilvl w:val="0"/>
+          <w:numId w:val="4"/>
+        </w:numPr>
+      </w:pPr>
+      <w:r>
+        <w:rPr>
+          <w:b/>
+          <w:bCs/>
+          <w:highlight w:val="yellow"/>
+          <w:lang w:val="en-IN"/>
+        </w:rPr>
+        <w:t>Reporting timelines </w:t>
+      </w:r>
+    </w:p>
+    <w:p>
+      <w:pPr>
+        <w:pStyle w:val="CommentText"/>
+      </w:pPr>
+      <w:r>
+        <w:rPr>
+          <w:b/>
+          <w:bCs/>
+          <w:highlight w:val="yellow"/>
+        </w:rPr>
+        <w:t>Reporting Event</w:t>
+      </w:r>
+      <w:r>
+        <w:rPr>
+          <w:highlight w:val="yellow"/>
+          <w:lang w:val="en-IN"/>
+        </w:rPr>
+        <w:t> </w:t>
+      </w:r>
+      <w:r>
+        <w:rPr>
+          <w:highlight w:val="yellow"/>
+          <w:lang w:val="en-IN"/>
+        </w:rPr>
+        <w:tab/>
+      </w:r>
+      <w:r>
+        <w:rPr>
+          <w:b/>
+          <w:bCs/>
+          <w:highlight w:val="yellow"/>
+        </w:rPr>
+        <w:t>Reporting authority</w:t>
+      </w:r>
+      <w:r>
+        <w:rPr>
+          <w:highlight w:val="yellow"/>
+          <w:lang w:val="en-IN"/>
+        </w:rPr>
+        <w:t> </w:t>
+      </w:r>
+      <w:r>
+        <w:rPr>
+          <w:highlight w:val="yellow"/>
+          <w:lang w:val="en-IN"/>
+        </w:rPr>
+        <w:tab/>
+      </w:r>
+      <w:r>
+        <w:rPr>
+          <w:b/>
+          <w:bCs/>
+          <w:highlight w:val="yellow"/>
+        </w:rPr>
+        <w:t>Reported to</w:t>
+      </w:r>
+      <w:r>
+        <w:rPr>
+          <w:highlight w:val="yellow"/>
+          <w:lang w:val="en-IN"/>
+        </w:rPr>
+        <w:t> </w:t>
+      </w:r>
+      <w:r>
+        <w:rPr>
+          <w:highlight w:val="yellow"/>
+          <w:lang w:val="en-IN"/>
+        </w:rPr>
+        <w:tab/>
+      </w:r>
+      <w:r>
+        <w:rPr>
+          <w:b/>
+          <w:bCs/>
+          <w:highlight w:val="yellow"/>
+        </w:rPr>
+        <w:t>Timeline for reporting</w:t>
+      </w:r>
+      <w:r>
+        <w:rPr>
+          <w:highlight w:val="yellow"/>
+          <w:lang w:val="en-IN"/>
+        </w:rPr>
+        <w:t> </w:t>
+      </w:r>
+      <w:r>
+        <w:rPr>
+          <w:highlight w:val="yellow"/>
+          <w:lang w:val="en-IN"/>
+        </w:rPr>
+        <w:tab/>
+      </w:r>
+      <w:r>
+        <w:rPr>
+          <w:b/>
+          <w:bCs/>
+          <w:highlight w:val="yellow"/>
+        </w:rPr>
+        <w:t>Response time for</w:t>
+      </w:r>
+      <w:r>
+        <w:rPr>
+          <w:highlight w:val="yellow"/>
+          <w:lang w:val="en-IN"/>
+        </w:rPr>
+        <w:t> </w:t>
+      </w:r>
+    </w:p>
+    <w:p>
+      <w:pPr>
+        <w:pStyle w:val="CommentText"/>
+      </w:pPr>
+      <w:r>
+        <w:rPr>
+          <w:highlight w:val="yellow"/>
+        </w:rPr>
+        <w:t>Safety event reporting</w:t>
+      </w:r>
+      <w:r>
+        <w:rPr>
+          <w:highlight w:val="yellow"/>
+          <w:lang w:val="en-IN"/>
+        </w:rPr>
+        <w:t> </w:t>
+      </w:r>
+      <w:r>
+        <w:rPr>
+          <w:highlight w:val="yellow"/>
+        </w:rPr>
+        <w:t>PI</w:t>
+      </w:r>
+      <w:r>
+        <w:rPr>
+          <w:highlight w:val="yellow"/>
+          <w:lang w:val="en-IN"/>
+        </w:rPr>
+        <w:t> </w:t>
+      </w:r>
+      <w:r>
+        <w:rPr>
+          <w:highlight w:val="yellow"/>
+        </w:rPr>
+        <w:t>TMG</w:t>
+      </w:r>
+      <w:r>
+        <w:rPr>
+          <w:highlight w:val="yellow"/>
+          <w:lang w:val="en-IN"/>
+        </w:rPr>
+        <w:t> </w:t>
+      </w:r>
+      <w:r>
+        <w:rPr>
+          <w:highlight w:val="yellow"/>
+        </w:rPr>
+        <w:t>PI-In 24 hrs</w:t>
+      </w:r>
+      <w:r>
+        <w:rPr>
+          <w:highlight w:val="yellow"/>
+          <w:lang w:val="en-IN"/>
+        </w:rPr>
+        <w:t> </w:t>
+      </w:r>
+      <w:r>
+        <w:rPr>
+          <w:highlight w:val="yellow"/>
+        </w:rPr>
+        <w:t>TMG-In 24 hrs </w:t>
+      </w:r>
+      <w:r>
+        <w:rPr>
+          <w:highlight w:val="yellow"/>
+          <w:lang w:val="en-IN"/>
+        </w:rPr>
+        <w:t> </w:t>
+      </w:r>
+    </w:p>
+    <w:p>
+      <w:pPr>
+        <w:pStyle w:val="CommentText"/>
+      </w:pPr>
+      <w:r>
+        <w:rPr>
+          <w:highlight w:val="yellow"/>
+        </w:rPr>
+        <w:t>Safety event reporting</w:t>
+      </w:r>
+      <w:r>
+        <w:rPr>
+          <w:highlight w:val="yellow"/>
+          <w:lang w:val="en-IN"/>
+        </w:rPr>
+        <w:t> </w:t>
+      </w:r>
+      <w:r>
+        <w:rPr>
+          <w:highlight w:val="yellow"/>
+        </w:rPr>
+        <w:t>PI</w:t>
+      </w:r>
+      <w:r>
+        <w:rPr>
+          <w:highlight w:val="yellow"/>
+          <w:lang w:val="en-IN"/>
+        </w:rPr>
+        <w:t> </w:t>
+      </w:r>
+      <w:r>
+        <w:rPr>
+          <w:highlight w:val="yellow"/>
+        </w:rPr>
+        <w:t>IEC</w:t>
+      </w:r>
+      <w:r>
+        <w:rPr>
+          <w:highlight w:val="yellow"/>
+          <w:lang w:val="en-IN"/>
+        </w:rPr>
+        <w:t> </w:t>
+      </w:r>
+      <w:r>
+        <w:rPr>
+          <w:highlight w:val="yellow"/>
+        </w:rPr>
+        <w:t>In 24 hrs</w:t>
+      </w:r>
+      <w:r>
+        <w:rPr>
+          <w:highlight w:val="yellow"/>
+          <w:lang w:val="en-IN"/>
+        </w:rPr>
+        <w:t> </w:t>
+      </w:r>
+      <w:r>
+        <w:rPr>
+          <w:highlight w:val="yellow"/>
+        </w:rPr>
+        <w:t>Not Applicable</w:t>
+      </w:r>
+      <w:r>
+        <w:rPr>
+          <w:highlight w:val="yellow"/>
+          <w:lang w:val="en-IN"/>
+        </w:rPr>
+        <w:t> </w:t>
+      </w:r>
+    </w:p>
+    <w:p>
+      <w:pPr>
+        <w:pStyle w:val="CommentText"/>
+      </w:pPr>
+      <w:r>
+        <w:rPr>
+          <w:highlight w:val="yellow"/>
+        </w:rPr>
+        <w:t>Safety event reporting</w:t>
+      </w:r>
+      <w:r>
+        <w:rPr>
+          <w:highlight w:val="yellow"/>
+          <w:lang w:val="en-IN"/>
+        </w:rPr>
+        <w:t> </w:t>
+      </w:r>
+      <w:r>
+        <w:rPr>
+          <w:highlight w:val="yellow"/>
+        </w:rPr>
+        <w:t>TMG</w:t>
+      </w:r>
+      <w:r>
+        <w:rPr>
+          <w:highlight w:val="yellow"/>
+          <w:lang w:val="en-IN"/>
+        </w:rPr>
+        <w:t> </w:t>
+      </w:r>
+      <w:r>
+        <w:rPr>
+          <w:highlight w:val="yellow"/>
+        </w:rPr>
+        <w:t>SDMC</w:t>
+      </w:r>
+      <w:r>
+        <w:rPr>
+          <w:highlight w:val="yellow"/>
+          <w:lang w:val="en-IN"/>
+        </w:rPr>
+        <w:t> </w:t>
+      </w:r>
+      <w:r>
+        <w:rPr>
+          <w:highlight w:val="yellow"/>
+        </w:rPr>
+        <w:t>TMG-within 2 days</w:t>
+      </w:r>
+      <w:r>
+        <w:rPr>
+          <w:highlight w:val="yellow"/>
+          <w:lang w:val="en-IN"/>
+        </w:rPr>
+        <w:t> </w:t>
+      </w:r>
+      <w:r>
+        <w:rPr>
+          <w:highlight w:val="yellow"/>
+        </w:rPr>
+        <w:t>SDMC-in 2 days</w:t>
+      </w:r>
+      <w:r>
+        <w:rPr>
+          <w:highlight w:val="yellow"/>
+          <w:lang w:val="en-IN"/>
+        </w:rPr>
+        <w:t> </w:t>
+      </w:r>
+    </w:p>
+    <w:p>
+      <w:pPr>
+        <w:pStyle w:val="CommentText"/>
+      </w:pPr>
+      <w:r>
+        <w:rPr>
+          <w:highlight w:val="yellow"/>
+        </w:rPr>
+        <w:t>PV</w:t>
+      </w:r>
+      <w:r>
+        <w:rPr>
+          <w:highlight w:val="yellow"/>
+          <w:lang w:val="en-IN"/>
+        </w:rPr>
+        <w:t> </w:t>
+      </w:r>
+      <w:r>
+        <w:rPr>
+          <w:highlight w:val="yellow"/>
+        </w:rPr>
+        <w:t>PI</w:t>
+      </w:r>
+      <w:r>
+        <w:rPr>
+          <w:highlight w:val="yellow"/>
+          <w:lang w:val="en-IN"/>
+        </w:rPr>
+        <w:t> </w:t>
+      </w:r>
+      <w:r>
+        <w:rPr>
+          <w:highlight w:val="yellow"/>
+        </w:rPr>
+        <w:t>Monitor</w:t>
+      </w:r>
+      <w:r>
+        <w:rPr>
+          <w:highlight w:val="yellow"/>
+          <w:lang w:val="en-IN"/>
+        </w:rPr>
+        <w:t> </w:t>
+      </w:r>
+      <w:r>
+        <w:rPr>
+          <w:highlight w:val="yellow"/>
+        </w:rPr>
+        <w:t>PI-within 2 days</w:t>
+      </w:r>
+      <w:r>
+        <w:rPr>
+          <w:highlight w:val="yellow"/>
+          <w:lang w:val="en-IN"/>
+        </w:rPr>
+        <w:t> </w:t>
+      </w:r>
+      <w:r>
+        <w:rPr>
+          <w:highlight w:val="yellow"/>
+        </w:rPr>
+        <w:t>PI to file CAPA within 5 days</w:t>
+      </w:r>
+      <w:r>
+        <w:rPr>
+          <w:lang w:val="en-IN"/>
+        </w:rPr>
+        <w:t> </w:t>
+      </w:r>
+    </w:p>
+  </w:comment>
+  <w:comment w:id="29" w:author="sranjan@masonlive.gmu.edu" w:date="2025-11-11T12:40:00Z" w:initials="SR">
     <w:p>
       <w:r>
         <w:rPr>
@@ -1941,24 +3426,31 @@
 
 <file path=word/commentsExtended.xml><?xml version="1.0" encoding="utf-8"?>
 <w15:commentsEx xmlns:wpc="http://schemas.microsoft.com/office/word/2010/wordprocessingCanvas" xmlns:cx="http://schemas.microsoft.com/office/drawing/2014/chartex" xmlns:cx1="http://schemas.microsoft.com/office/drawing/2015/9/8/chartex" xmlns:cx2="http://schemas.microsoft.com/office/drawing/2015/10/21/chartex" xmlns:cx3="http://schemas.microsoft.com/office/drawing/2016/5/9/chartex" xmlns:cx4="http://schemas.microsoft.com/office/drawing/2016/5/10/chartex" xmlns:cx5="http://schemas.microsoft.com/office/drawing/2016/5/11/chartex" xmlns:cx6="http://schemas.microsoft.com/office/drawing/2016/5/12/chartex" xmlns:cx7="http://schemas.microsoft.com/office/drawing/2016/5/13/chartex" xmlns:cx8="http://schemas.microsoft.com/office/drawing/2016/5/14/chartex" xmlns:mc="http://schemas.openxmlformats.org/markup-compatibility/2006" xmlns:aink="http://schemas.microsoft.com/office/drawing/2016/ink" xmlns:am3d="http://schemas.microsoft.com/office/drawing/2017/model3d" xmlns:o="urn:schemas-microsoft-com:office:office" xmlns:oel="http://schemas.microsoft.com/office/2019/extlst" xmlns:r="http://schemas.openxmlformats.org/officeDocument/2006/relationships" xmlns:m="http://schemas.openxmlformats.org/officeDocument/2006/math" xmlns:v="urn:schemas-microsoft-com:vml" xmlns:wp14="http://schemas.microsoft.com/office/word/2010/wordprocessingDrawing" xmlns:wp="http://schemas.openxmlformats.org/drawingml/2006/wordprocessingDrawing" xmlns:w10="urn:schemas-microsoft-com:office:word" xmlns:w="http://schemas.openxmlformats.org/wordprocessingml/2006/main" xmlns:w14="http://schemas.microsoft.com/office/word/2010/wordml" xmlns:w15="http://schemas.microsoft.com/office/word/2012/wordml" xmlns:w16cex="http://schemas.microsoft.com/office/word/2018/wordml/cex" xmlns:w16cid="http://schemas.microsoft.com/office/word/2016/wordml/cid" xmlns:w16="http://schemas.microsoft.com/office/word/2018/wordml" xmlns:w16du="http://schemas.microsoft.com/office/word/2023/wordml/word16du" xmlns:w16sdtdh="http://schemas.microsoft.com/office/word/2020/wordml/sdtdatahash" xmlns:w16sdtfl="http://schemas.microsoft.com/office/word/2024/wordml/sdtformatlock" xmlns:w16se="http://schemas.microsoft.com/office/word/2015/wordml/symex" xmlns:wpg="http://schemas.microsoft.com/office/word/2010/wordprocessingGroup" xmlns:wpi="http://schemas.microsoft.com/office/word/2010/wordprocessingInk" xmlns:wne="http://schemas.microsoft.com/office/word/2006/wordml" xmlns:wps="http://schemas.microsoft.com/office/word/2010/wordprocessingShape" mc:Ignorable="w14 w15 w16se w16cid w16 w16cex w16sdtdh w16sdtfl w16du wp14">
-  <w15:commentEx w15:paraId="17926B5C" w15:done="0"/>
-  <w15:commentEx w15:paraId="03A06A3F" w15:paraIdParent="17926B5C" w15:done="0"/>
-  <w15:commentEx w15:paraId="3A9725F1" w15:done="0"/>
-  <w15:commentEx w15:paraId="1EFA95EE" w15:paraIdParent="3A9725F1" w15:done="0"/>
-  <w15:commentEx w15:paraId="535CA384" w15:done="0"/>
-  <w15:commentEx w15:paraId="0638B70B" w15:done="0"/>
-  <w15:commentEx w15:paraId="1F079CDA" w15:done="0"/>
+  <w15:commentEx w15:paraId="17926B5C" w15:done="1"/>
+  <w15:commentEx w15:paraId="03A06A3F" w15:paraIdParent="17926B5C" w15:done="1"/>
+  <w15:commentEx w15:paraId="78FD6BCF" w15:paraIdParent="17926B5C" w15:done="1"/>
+  <w15:commentEx w15:paraId="3DC947B9" w15:paraIdParent="17926B5C" w15:done="1"/>
+  <w15:commentEx w15:paraId="7C89C161" w15:done="1"/>
+  <w15:commentEx w15:paraId="3A9725F1" w15:done="1"/>
+  <w15:commentEx w15:paraId="1EFA95EE" w15:paraIdParent="3A9725F1" w15:done="1"/>
+  <w15:commentEx w15:paraId="535CA384" w15:done="1"/>
+  <w15:commentEx w15:paraId="0638B70B" w15:done="1"/>
+  <w15:commentEx w15:paraId="0F0C1141" w15:paraIdParent="0638B70B" w15:done="1"/>
+  <w15:commentEx w15:paraId="5D3DAE1E" w15:paraIdParent="0638B70B" w15:done="1"/>
+  <w15:commentEx w15:paraId="0EF176D0" w15:done="1"/>
   <w15:commentEx w15:paraId="238EF83C" w15:done="0"/>
-  <w15:commentEx w15:paraId="2A017460" w15:done="0"/>
-  <w15:commentEx w15:paraId="47EC60A0" w15:done="0"/>
+  <w15:commentEx w15:paraId="2A017460" w15:done="1"/>
+  <w15:commentEx w15:paraId="5D3E88B1" w15:paraIdParent="2A017460" w15:done="1"/>
+  <w15:commentEx w15:paraId="47EC60A0" w15:done="1"/>
   <w15:commentEx w15:paraId="4AFF131D" w15:done="0"/>
   <w15:commentEx w15:paraId="0A5BD6F2" w15:paraIdParent="4AFF131D" w15:done="0"/>
-  <w15:commentEx w15:paraId="114ADCDB" w15:done="0"/>
-  <w15:commentEx w15:paraId="603391EA" w15:done="0"/>
-  <w15:commentEx w15:paraId="7F61E246" w15:done="0"/>
-  <w15:commentEx w15:paraId="22B2B5FC" w15:paraIdParent="7F61E246" w15:done="0"/>
-  <w15:commentEx w15:paraId="72E51D2C" w15:done="0"/>
-  <w15:commentEx w15:paraId="7B6F71F6" w15:done="0"/>
+  <w15:commentEx w15:paraId="140A0821" w15:done="1"/>
+  <w15:commentEx w15:paraId="603391EA" w15:done="1"/>
+  <w15:commentEx w15:paraId="7F61E246" w15:done="1"/>
+  <w15:commentEx w15:paraId="22B2B5FC" w15:paraIdParent="7F61E246" w15:done="1"/>
+  <w15:commentEx w15:paraId="72E51D2C" w15:done="1"/>
+  <w15:commentEx w15:paraId="351F04B5" w15:paraIdParent="72E51D2C" w15:done="1"/>
+  <w15:commentEx w15:paraId="7B6F71F6" w15:done="1"/>
 </w15:commentsEx>
 </file>
 
@@ -1966,21 +3458,27 @@
 <w16cex:commentsExtensible xmlns:wpc="http://schemas.microsoft.com/office/word/2010/wordprocessingCanvas" xmlns:cx="http://schemas.microsoft.com/office/drawing/2014/chartex" xmlns:cx1="http://schemas.microsoft.com/office/drawing/2015/9/8/chartex" xmlns:cx2="http://schemas.microsoft.com/office/drawing/2015/10/21/chartex" xmlns:cx3="http://schemas.microsoft.com/office/drawing/2016/5/9/chartex" xmlns:cx4="http://schemas.microsoft.com/office/drawing/2016/5/10/chartex" xmlns:cx5="http://schemas.microsoft.com/office/drawing/2016/5/11/chartex" xmlns:cx6="http://schemas.microsoft.com/office/drawing/2016/5/12/chartex" xmlns:cx7="http://schemas.microsoft.com/office/drawing/2016/5/13/chartex" xmlns:cx8="http://schemas.microsoft.com/office/drawing/2016/5/14/chartex" xmlns:cr="http://schemas.microsoft.com/office/comments/2020/reactions" xmlns:mc="http://schemas.openxmlformats.org/markup-compatibility/2006" xmlns:aink="http://schemas.microsoft.com/office/drawing/2016/ink" xmlns:am3d="http://schemas.microsoft.com/office/drawing/2017/model3d" xmlns:o="urn:schemas-microsoft-com:office:office" xmlns:oel="http://schemas.microsoft.com/office/2019/extlst" xmlns:r="http://schemas.openxmlformats.org/officeDocument/2006/relationships" xmlns:m="http://schemas.openxmlformats.org/officeDocument/2006/math" xmlns:v="urn:schemas-microsoft-com:vml" xmlns:wp14="http://schemas.microsoft.com/office/word/2010/wordprocessingDrawing" xmlns:wp="http://schemas.openxmlformats.org/drawingml/2006/wordprocessingDrawing" xmlns:w10="urn:schemas-microsoft-com:office:word" xmlns:w="http://schemas.openxmlformats.org/wordprocessingml/2006/main" xmlns:w14="http://schemas.microsoft.com/office/word/2010/wordml" xmlns:w15="http://schemas.microsoft.com/office/word/2012/wordml" xmlns:w16cex="http://schemas.microsoft.com/office/word/2018/wordml/cex" xmlns:w16cid="http://schemas.microsoft.com/office/word/2016/wordml/cid" xmlns:w16="http://schemas.microsoft.com/office/word/2018/wordml" xmlns:w16du="http://schemas.microsoft.com/office/word/2023/wordml/word16du" xmlns:w16sdtdh="http://schemas.microsoft.com/office/word/2020/wordml/sdtdatahash" xmlns:w16sdtfl="http://schemas.microsoft.com/office/word/2024/wordml/sdtformatlock" xmlns:w16se="http://schemas.microsoft.com/office/word/2015/wordml/symex" xmlns:wpg="http://schemas.microsoft.com/office/word/2010/wordprocessingGroup" xmlns:wpi="http://schemas.microsoft.com/office/word/2010/wordprocessingInk" xmlns:wne="http://schemas.microsoft.com/office/word/2006/wordml" xmlns:wps="http://schemas.microsoft.com/office/word/2010/wordprocessingShape" mc:Ignorable="w14 w15 w16se w16cid w16 w16cex w16sdtdh w16sdtfl cr w16du wp14">
   <w16cex:commentExtensible w16cex:durableId="2A148ECE" w16cex:dateUtc="2025-11-11T14:06:00Z"/>
   <w16cex:commentExtensible w16cex:durableId="5C9CA2F5" w16cex:dateUtc="2025-11-22T03:31:00Z"/>
+  <w16cex:commentExtensible w16cex:durableId="5ACF93A1" w16cex:dateUtc="2025-11-27T06:50:00Z"/>
+  <w16cex:commentExtensible w16cex:durableId="7D24AAFE" w16cex:dateUtc="2025-12-05T21:40:00Z"/>
+  <w16cex:commentExtensible w16cex:durableId="6E636E74" w16cex:dateUtc="2025-11-26T23:42:00Z"/>
   <w16cex:commentExtensible w16cex:durableId="41A4792D" w16cex:dateUtc="2025-11-11T15:47:00Z"/>
   <w16cex:commentExtensible w16cex:durableId="4D0A91D8" w16cex:dateUtc="2025-11-22T04:26:00Z"/>
   <w16cex:commentExtensible w16cex:durableId="73CA012D" w16cex:dateUtc="2025-11-11T17:45:00Z"/>
   <w16cex:commentExtensible w16cex:durableId="0AE3B3A0" w16cex:dateUtc="2025-11-22T04:43:00Z"/>
-  <w16cex:commentExtensible w16cex:durableId="273CFB31" w16cex:dateUtc="2025-11-22T04:44:00Z"/>
+  <w16cex:commentExtensible w16cex:durableId="19B17442" w16cex:dateUtc="2025-11-27T06:50:00Z"/>
+  <w16cex:commentExtensible w16cex:durableId="131EC644" w16cex:dateUtc="2025-12-05T21:43:00Z"/>
+  <w16cex:commentExtensible w16cex:durableId="1898F8F5" w16cex:dateUtc="2025-11-26T23:52:00Z"/>
   <w16cex:commentExtensible w16cex:durableId="56F0BB08" w16cex:dateUtc="2025-11-11T17:46:00Z"/>
   <w16cex:commentExtensible w16cex:durableId="4C4F9313" w16cex:dateUtc="2025-11-11T15:51:00Z"/>
   <w16cex:commentExtensible w16cex:durableId="7B8A15D9" w16cex:dateUtc="2025-11-11T15:56:00Z"/>
   <w16cex:commentExtensible w16cex:durableId="64A2A3A3" w16cex:dateUtc="2025-11-11T15:58:00Z"/>
   <w16cex:commentExtensible w16cex:durableId="7A868877" w16cex:dateUtc="2025-11-11T16:33:00Z"/>
-  <w16cex:commentExtensible w16cex:durableId="5AB649CB" w16cex:dateUtc="2025-11-22T04:59:00Z"/>
+  <w16cex:commentExtensible w16cex:durableId="2F41ACC8" w16cex:dateUtc="2025-11-27T00:13:00Z"/>
   <w16cex:commentExtensible w16cex:durableId="27B3CA15" w16cex:dateUtc="2025-11-11T16:43:00Z"/>
   <w16cex:commentExtensible w16cex:durableId="6A421D1C" w16cex:dateUtc="2025-11-11T16:50:00Z"/>
   <w16cex:commentExtensible w16cex:durableId="7079673B" w16cex:dateUtc="2025-11-11T16:50:00Z"/>
   <w16cex:commentExtensible w16cex:durableId="2033C2A9" w16cex:dateUtc="2025-11-11T16:53:00Z"/>
+  <w16cex:commentExtensible w16cex:durableId="31467317" w16cex:dateUtc="2025-11-27T06:53:00Z"/>
   <w16cex:commentExtensible w16cex:durableId="1CD30F6E" w16cex:dateUtc="2025-11-11T17:40:00Z"/>
 </w16cex:commentsExtensible>
 </file>
@@ -1989,23 +3487,445 @@
 <w16cid:commentsIds xmlns:wpc="http://schemas.microsoft.com/office/word/2010/wordprocessingCanvas" xmlns:cx="http://schemas.microsoft.com/office/drawing/2014/chartex" xmlns:cx1="http://schemas.microsoft.com/office/drawing/2015/9/8/chartex" xmlns:cx2="http://schemas.microsoft.com/office/drawing/2015/10/21/chartex" xmlns:cx3="http://schemas.microsoft.com/office/drawing/2016/5/9/chartex" xmlns:cx4="http://schemas.microsoft.com/office/drawing/2016/5/10/chartex" xmlns:cx5="http://schemas.microsoft.com/office/drawing/2016/5/11/chartex" xmlns:cx6="http://schemas.microsoft.com/office/drawing/2016/5/12/chartex" xmlns:cx7="http://schemas.microsoft.com/office/drawing/2016/5/13/chartex" xmlns:cx8="http://schemas.microsoft.com/office/drawing/2016/5/14/chartex" xmlns:mc="http://schemas.openxmlformats.org/markup-compatibility/2006" xmlns:aink="http://schemas.microsoft.com/office/drawing/2016/ink" xmlns:am3d="http://schemas.microsoft.com/office/drawing/2017/model3d" xmlns:o="urn:schemas-microsoft-com:office:office" xmlns:oel="http://schemas.microsoft.com/office/2019/extlst" xmlns:r="http://schemas.openxmlformats.org/officeDocument/2006/relationships" xmlns:m="http://schemas.openxmlformats.org/officeDocument/2006/math" xmlns:v="urn:schemas-microsoft-com:vml" xmlns:wp14="http://schemas.microsoft.com/office/word/2010/wordprocessingDrawing" xmlns:wp="http://schemas.openxmlformats.org/drawingml/2006/wordprocessingDrawing" xmlns:w10="urn:schemas-microsoft-com:office:word" xmlns:w="http://schemas.openxmlformats.org/wordprocessingml/2006/main" xmlns:w14="http://schemas.microsoft.com/office/word/2010/wordml" xmlns:w15="http://schemas.microsoft.com/office/word/2012/wordml" xmlns:w16cex="http://schemas.microsoft.com/office/word/2018/wordml/cex" xmlns:w16cid="http://schemas.microsoft.com/office/word/2016/wordml/cid" xmlns:w16="http://schemas.microsoft.com/office/word/2018/wordml" xmlns:w16du="http://schemas.microsoft.com/office/word/2023/wordml/word16du" xmlns:w16sdtdh="http://schemas.microsoft.com/office/word/2020/wordml/sdtdatahash" xmlns:w16sdtfl="http://schemas.microsoft.com/office/word/2024/wordml/sdtformatlock" xmlns:w16se="http://schemas.microsoft.com/office/word/2015/wordml/symex" xmlns:wpg="http://schemas.microsoft.com/office/word/2010/wordprocessingGroup" xmlns:wpi="http://schemas.microsoft.com/office/word/2010/wordprocessingInk" xmlns:wne="http://schemas.microsoft.com/office/word/2006/wordml" xmlns:wps="http://schemas.microsoft.com/office/word/2010/wordprocessingShape" mc:Ignorable="w14 w15 w16se w16cid w16 w16cex w16sdtdh w16sdtfl w16du wp14">
   <w16cid:commentId w16cid:paraId="17926B5C" w16cid:durableId="2A148ECE"/>
   <w16cid:commentId w16cid:paraId="03A06A3F" w16cid:durableId="5C9CA2F5"/>
+  <w16cid:commentId w16cid:paraId="78FD6BCF" w16cid:durableId="5ACF93A1"/>
+  <w16cid:commentId w16cid:paraId="3DC947B9" w16cid:durableId="7D24AAFE"/>
+  <w16cid:commentId w16cid:paraId="7C89C161" w16cid:durableId="6E636E74"/>
   <w16cid:commentId w16cid:paraId="3A9725F1" w16cid:durableId="41A4792D"/>
   <w16cid:commentId w16cid:paraId="1EFA95EE" w16cid:durableId="4D0A91D8"/>
   <w16cid:commentId w16cid:paraId="535CA384" w16cid:durableId="73CA012D"/>
   <w16cid:commentId w16cid:paraId="0638B70B" w16cid:durableId="0AE3B3A0"/>
-  <w16cid:commentId w16cid:paraId="1F079CDA" w16cid:durableId="273CFB31"/>
+  <w16cid:commentId w16cid:paraId="0F0C1141" w16cid:durableId="19B17442"/>
+  <w16cid:commentId w16cid:paraId="5D3DAE1E" w16cid:durableId="131EC644"/>
+  <w16cid:commentId w16cid:paraId="0EF176D0" w16cid:durableId="1898F8F5"/>
   <w16cid:commentId w16cid:paraId="238EF83C" w16cid:durableId="56F0BB08"/>
   <w16cid:commentId w16cid:paraId="2A017460" w16cid:durableId="4C4F9313"/>
+  <w16cid:commentId w16cid:paraId="5D3E88B1" w16cid:durableId="2CD81684"/>
   <w16cid:commentId w16cid:paraId="47EC60A0" w16cid:durableId="7B8A15D9"/>
   <w16cid:commentId w16cid:paraId="4AFF131D" w16cid:durableId="64A2A3A3"/>
   <w16cid:commentId w16cid:paraId="0A5BD6F2" w16cid:durableId="7A868877"/>
-  <w16cid:commentId w16cid:paraId="114ADCDB" w16cid:durableId="5AB649CB"/>
+  <w16cid:commentId w16cid:paraId="140A0821" w16cid:durableId="2F41ACC8"/>
   <w16cid:commentId w16cid:paraId="603391EA" w16cid:durableId="27B3CA15"/>
   <w16cid:commentId w16cid:paraId="7F61E246" w16cid:durableId="6A421D1C"/>
   <w16cid:commentId w16cid:paraId="22B2B5FC" w16cid:durableId="7079673B"/>
   <w16cid:commentId w16cid:paraId="72E51D2C" w16cid:durableId="2033C2A9"/>
+  <w16cid:commentId w16cid:paraId="351F04B5" w16cid:durableId="31467317"/>
   <w16cid:commentId w16cid:paraId="7B6F71F6" w16cid:durableId="1CD30F6E"/>
 </w16cid:commentsIds>
+</file>
+
+<file path=word/numbering.xml><?xml version="1.0" encoding="utf-8"?>
+<w:numbering xmlns:wpc="http://schemas.microsoft.com/office/word/2010/wordprocessingCanvas" xmlns:cx="http://schemas.microsoft.com/office/drawing/2014/chartex" xmlns:cx1="http://schemas.microsoft.com/office/drawing/2015/9/8/chartex" xmlns:cx2="http://schemas.microsoft.com/office/drawing/2015/10/21/chartex" xmlns:cx3="http://schemas.microsoft.com/office/drawing/2016/5/9/chartex" xmlns:cx4="http://schemas.microsoft.com/office/drawing/2016/5/10/chartex" xmlns:cx5="http://schemas.microsoft.com/office/drawing/2016/5/11/chartex" xmlns:cx6="http://schemas.microsoft.com/office/drawing/2016/5/12/chartex" xmlns:cx7="http://schemas.microsoft.com/office/drawing/2016/5/13/chartex" xmlns:cx8="http://schemas.microsoft.com/office/drawing/2016/5/14/chartex" xmlns:mc="http://schemas.openxmlformats.org/markup-compatibility/2006" xmlns:aink="http://schemas.microsoft.com/office/drawing/2016/ink" xmlns:am3d="http://schemas.microsoft.com/office/drawing/2017/model3d" xmlns:o="urn:schemas-microsoft-com:office:office" xmlns:oel="http://schemas.microsoft.com/office/2019/extlst" xmlns:r="http://schemas.openxmlformats.org/officeDocument/2006/relationships" xmlns:m="http://schemas.openxmlformats.org/officeDocument/2006/math" xmlns:v="urn:schemas-microsoft-com:vml" xmlns:wp14="http://schemas.microsoft.com/office/word/2010/wordprocessingDrawing" xmlns:wp="http://schemas.openxmlformats.org/drawingml/2006/wordprocessingDrawing" xmlns:w10="urn:schemas-microsoft-com:office:word" xmlns:w="http://schemas.openxmlformats.org/wordprocessingml/2006/main" xmlns:w14="http://schemas.microsoft.com/office/word/2010/wordml" xmlns:w15="http://schemas.microsoft.com/office/word/2012/wordml" xmlns:w16cex="http://schemas.microsoft.com/office/word/2018/wordml/cex" xmlns:w16cid="http://schemas.microsoft.com/office/word/2016/wordml/cid" xmlns:w16="http://schemas.microsoft.com/office/word/2018/wordml" xmlns:w16du="http://schemas.microsoft.com/office/word/2023/wordml/word16du" xmlns:w16sdtdh="http://schemas.microsoft.com/office/word/2020/wordml/sdtdatahash" xmlns:w16sdtfl="http://schemas.microsoft.com/office/word/2024/wordml/sdtformatlock" xmlns:w16se="http://schemas.microsoft.com/office/word/2015/wordml/symex" xmlns:wpg="http://schemas.microsoft.com/office/word/2010/wordprocessingGroup" xmlns:wpi="http://schemas.microsoft.com/office/word/2010/wordprocessingInk" xmlns:wne="http://schemas.microsoft.com/office/word/2006/wordml" xmlns:wps="http://schemas.microsoft.com/office/word/2010/wordprocessingShape" mc:Ignorable="w14 w15 w16se w16cid w16 w16cex w16sdtdh w16sdtfl w16du wp14">
+  <w:abstractNum w:abstractNumId="0" w15:restartNumberingAfterBreak="0">
+    <w:nsid w:val="147C1FA5"/>
+    <w:multiLevelType w:val="hybridMultilevel"/>
+    <w:tmpl w:val="5212D52E"/>
+    <w:lvl w:ilvl="0" w:tplc="C42C5738">
+      <w:start w:val="1"/>
+      <w:numFmt w:val="bullet"/>
+      <w:lvlText w:val=""/>
+      <w:lvlJc w:val="left"/>
+      <w:pPr>
+        <w:ind w:left="1440" w:hanging="360"/>
+      </w:pPr>
+      <w:rPr>
+        <w:rFonts w:ascii="Symbol" w:hAnsi="Symbol"/>
+      </w:rPr>
+    </w:lvl>
+    <w:lvl w:ilvl="1" w:tplc="7ACC8436">
+      <w:start w:val="1"/>
+      <w:numFmt w:val="bullet"/>
+      <w:lvlText w:val=""/>
+      <w:lvlJc w:val="left"/>
+      <w:pPr>
+        <w:ind w:left="1440" w:hanging="360"/>
+      </w:pPr>
+      <w:rPr>
+        <w:rFonts w:ascii="Symbol" w:hAnsi="Symbol"/>
+      </w:rPr>
+    </w:lvl>
+    <w:lvl w:ilvl="2" w:tplc="76DEC14A">
+      <w:start w:val="1"/>
+      <w:numFmt w:val="bullet"/>
+      <w:lvlText w:val=""/>
+      <w:lvlJc w:val="left"/>
+      <w:pPr>
+        <w:ind w:left="1440" w:hanging="360"/>
+      </w:pPr>
+      <w:rPr>
+        <w:rFonts w:ascii="Symbol" w:hAnsi="Symbol"/>
+      </w:rPr>
+    </w:lvl>
+    <w:lvl w:ilvl="3" w:tplc="C5469276">
+      <w:start w:val="1"/>
+      <w:numFmt w:val="bullet"/>
+      <w:lvlText w:val=""/>
+      <w:lvlJc w:val="left"/>
+      <w:pPr>
+        <w:ind w:left="1440" w:hanging="360"/>
+      </w:pPr>
+      <w:rPr>
+        <w:rFonts w:ascii="Symbol" w:hAnsi="Symbol"/>
+      </w:rPr>
+    </w:lvl>
+    <w:lvl w:ilvl="4" w:tplc="4D4A6790">
+      <w:start w:val="1"/>
+      <w:numFmt w:val="bullet"/>
+      <w:lvlText w:val=""/>
+      <w:lvlJc w:val="left"/>
+      <w:pPr>
+        <w:ind w:left="1440" w:hanging="360"/>
+      </w:pPr>
+      <w:rPr>
+        <w:rFonts w:ascii="Symbol" w:hAnsi="Symbol"/>
+      </w:rPr>
+    </w:lvl>
+    <w:lvl w:ilvl="5" w:tplc="9872FAF8">
+      <w:start w:val="1"/>
+      <w:numFmt w:val="bullet"/>
+      <w:lvlText w:val=""/>
+      <w:lvlJc w:val="left"/>
+      <w:pPr>
+        <w:ind w:left="1440" w:hanging="360"/>
+      </w:pPr>
+      <w:rPr>
+        <w:rFonts w:ascii="Symbol" w:hAnsi="Symbol"/>
+      </w:rPr>
+    </w:lvl>
+    <w:lvl w:ilvl="6" w:tplc="9888234E">
+      <w:start w:val="1"/>
+      <w:numFmt w:val="bullet"/>
+      <w:lvlText w:val=""/>
+      <w:lvlJc w:val="left"/>
+      <w:pPr>
+        <w:ind w:left="1440" w:hanging="360"/>
+      </w:pPr>
+      <w:rPr>
+        <w:rFonts w:ascii="Symbol" w:hAnsi="Symbol"/>
+      </w:rPr>
+    </w:lvl>
+    <w:lvl w:ilvl="7" w:tplc="DA0C9254">
+      <w:start w:val="1"/>
+      <w:numFmt w:val="bullet"/>
+      <w:lvlText w:val=""/>
+      <w:lvlJc w:val="left"/>
+      <w:pPr>
+        <w:ind w:left="1440" w:hanging="360"/>
+      </w:pPr>
+      <w:rPr>
+        <w:rFonts w:ascii="Symbol" w:hAnsi="Symbol"/>
+      </w:rPr>
+    </w:lvl>
+    <w:lvl w:ilvl="8" w:tplc="182CD6FE">
+      <w:start w:val="1"/>
+      <w:numFmt w:val="bullet"/>
+      <w:lvlText w:val=""/>
+      <w:lvlJc w:val="left"/>
+      <w:pPr>
+        <w:ind w:left="1440" w:hanging="360"/>
+      </w:pPr>
+      <w:rPr>
+        <w:rFonts w:ascii="Symbol" w:hAnsi="Symbol"/>
+      </w:rPr>
+    </w:lvl>
+  </w:abstractNum>
+  <w:abstractNum w:abstractNumId="1" w15:restartNumberingAfterBreak="0">
+    <w:nsid w:val="316E1411"/>
+    <w:multiLevelType w:val="hybridMultilevel"/>
+    <w:tmpl w:val="119AA558"/>
+    <w:lvl w:ilvl="0" w:tplc="A3A6BCFA">
+      <w:start w:val="1"/>
+      <w:numFmt w:val="decimal"/>
+      <w:lvlText w:val="%1."/>
+      <w:lvlJc w:val="left"/>
+      <w:pPr>
+        <w:ind w:left="1440" w:hanging="360"/>
+      </w:pPr>
+    </w:lvl>
+    <w:lvl w:ilvl="1" w:tplc="4C1AD858">
+      <w:start w:val="1"/>
+      <w:numFmt w:val="decimal"/>
+      <w:lvlText w:val="%2."/>
+      <w:lvlJc w:val="left"/>
+      <w:pPr>
+        <w:ind w:left="1440" w:hanging="360"/>
+      </w:pPr>
+    </w:lvl>
+    <w:lvl w:ilvl="2" w:tplc="272C2844">
+      <w:start w:val="1"/>
+      <w:numFmt w:val="decimal"/>
+      <w:lvlText w:val="%3."/>
+      <w:lvlJc w:val="left"/>
+      <w:pPr>
+        <w:ind w:left="1440" w:hanging="360"/>
+      </w:pPr>
+    </w:lvl>
+    <w:lvl w:ilvl="3" w:tplc="34E47E80">
+      <w:start w:val="1"/>
+      <w:numFmt w:val="decimal"/>
+      <w:lvlText w:val="%4."/>
+      <w:lvlJc w:val="left"/>
+      <w:pPr>
+        <w:ind w:left="1440" w:hanging="360"/>
+      </w:pPr>
+    </w:lvl>
+    <w:lvl w:ilvl="4" w:tplc="7A4AD580">
+      <w:start w:val="1"/>
+      <w:numFmt w:val="decimal"/>
+      <w:lvlText w:val="%5."/>
+      <w:lvlJc w:val="left"/>
+      <w:pPr>
+        <w:ind w:left="1440" w:hanging="360"/>
+      </w:pPr>
+    </w:lvl>
+    <w:lvl w:ilvl="5" w:tplc="410E064C">
+      <w:start w:val="1"/>
+      <w:numFmt w:val="decimal"/>
+      <w:lvlText w:val="%6."/>
+      <w:lvlJc w:val="left"/>
+      <w:pPr>
+        <w:ind w:left="1440" w:hanging="360"/>
+      </w:pPr>
+    </w:lvl>
+    <w:lvl w:ilvl="6" w:tplc="125002D8">
+      <w:start w:val="1"/>
+      <w:numFmt w:val="decimal"/>
+      <w:lvlText w:val="%7."/>
+      <w:lvlJc w:val="left"/>
+      <w:pPr>
+        <w:ind w:left="1440" w:hanging="360"/>
+      </w:pPr>
+    </w:lvl>
+    <w:lvl w:ilvl="7" w:tplc="6C92964E">
+      <w:start w:val="1"/>
+      <w:numFmt w:val="decimal"/>
+      <w:lvlText w:val="%8."/>
+      <w:lvlJc w:val="left"/>
+      <w:pPr>
+        <w:ind w:left="1440" w:hanging="360"/>
+      </w:pPr>
+    </w:lvl>
+    <w:lvl w:ilvl="8" w:tplc="BE3A704A">
+      <w:start w:val="1"/>
+      <w:numFmt w:val="decimal"/>
+      <w:lvlText w:val="%9."/>
+      <w:lvlJc w:val="left"/>
+      <w:pPr>
+        <w:ind w:left="1440" w:hanging="360"/>
+      </w:pPr>
+    </w:lvl>
+  </w:abstractNum>
+  <w:abstractNum w:abstractNumId="2" w15:restartNumberingAfterBreak="0">
+    <w:nsid w:val="4457764E"/>
+    <w:multiLevelType w:val="hybridMultilevel"/>
+    <w:tmpl w:val="B5C24960"/>
+    <w:lvl w:ilvl="0" w:tplc="4009000F">
+      <w:start w:val="1"/>
+      <w:numFmt w:val="decimal"/>
+      <w:lvlText w:val="%1."/>
+      <w:lvlJc w:val="left"/>
+      <w:pPr>
+        <w:ind w:left="720" w:hanging="360"/>
+      </w:pPr>
+    </w:lvl>
+    <w:lvl w:ilvl="1" w:tplc="40090019" w:tentative="1">
+      <w:start w:val="1"/>
+      <w:numFmt w:val="lowerLetter"/>
+      <w:lvlText w:val="%2."/>
+      <w:lvlJc w:val="left"/>
+      <w:pPr>
+        <w:ind w:left="1440" w:hanging="360"/>
+      </w:pPr>
+    </w:lvl>
+    <w:lvl w:ilvl="2" w:tplc="4009001B" w:tentative="1">
+      <w:start w:val="1"/>
+      <w:numFmt w:val="lowerRoman"/>
+      <w:lvlText w:val="%3."/>
+      <w:lvlJc w:val="right"/>
+      <w:pPr>
+        <w:ind w:left="2160" w:hanging="180"/>
+      </w:pPr>
+    </w:lvl>
+    <w:lvl w:ilvl="3" w:tplc="4009000F" w:tentative="1">
+      <w:start w:val="1"/>
+      <w:numFmt w:val="decimal"/>
+      <w:lvlText w:val="%4."/>
+      <w:lvlJc w:val="left"/>
+      <w:pPr>
+        <w:ind w:left="2880" w:hanging="360"/>
+      </w:pPr>
+    </w:lvl>
+    <w:lvl w:ilvl="4" w:tplc="40090019" w:tentative="1">
+      <w:start w:val="1"/>
+      <w:numFmt w:val="lowerLetter"/>
+      <w:lvlText w:val="%5."/>
+      <w:lvlJc w:val="left"/>
+      <w:pPr>
+        <w:ind w:left="3600" w:hanging="360"/>
+      </w:pPr>
+    </w:lvl>
+    <w:lvl w:ilvl="5" w:tplc="4009001B" w:tentative="1">
+      <w:start w:val="1"/>
+      <w:numFmt w:val="lowerRoman"/>
+      <w:lvlText w:val="%6."/>
+      <w:lvlJc w:val="right"/>
+      <w:pPr>
+        <w:ind w:left="4320" w:hanging="180"/>
+      </w:pPr>
+    </w:lvl>
+    <w:lvl w:ilvl="6" w:tplc="4009000F" w:tentative="1">
+      <w:start w:val="1"/>
+      <w:numFmt w:val="decimal"/>
+      <w:lvlText w:val="%7."/>
+      <w:lvlJc w:val="left"/>
+      <w:pPr>
+        <w:ind w:left="5040" w:hanging="360"/>
+      </w:pPr>
+    </w:lvl>
+    <w:lvl w:ilvl="7" w:tplc="40090019" w:tentative="1">
+      <w:start w:val="1"/>
+      <w:numFmt w:val="lowerLetter"/>
+      <w:lvlText w:val="%8."/>
+      <w:lvlJc w:val="left"/>
+      <w:pPr>
+        <w:ind w:left="5760" w:hanging="360"/>
+      </w:pPr>
+    </w:lvl>
+    <w:lvl w:ilvl="8" w:tplc="4009001B" w:tentative="1">
+      <w:start w:val="1"/>
+      <w:numFmt w:val="lowerRoman"/>
+      <w:lvlText w:val="%9."/>
+      <w:lvlJc w:val="right"/>
+      <w:pPr>
+        <w:ind w:left="6480" w:hanging="180"/>
+      </w:pPr>
+    </w:lvl>
+  </w:abstractNum>
+  <w:abstractNum w:abstractNumId="3" w15:restartNumberingAfterBreak="0">
+    <w:nsid w:val="5471463F"/>
+    <w:multiLevelType w:val="hybridMultilevel"/>
+    <w:tmpl w:val="65E2E724"/>
+    <w:lvl w:ilvl="0" w:tplc="40090001">
+      <w:start w:val="1"/>
+      <w:numFmt w:val="bullet"/>
+      <w:lvlText w:val=""/>
+      <w:lvlJc w:val="left"/>
+      <w:pPr>
+        <w:ind w:left="720" w:hanging="360"/>
+      </w:pPr>
+      <w:rPr>
+        <w:rFonts w:ascii="Symbol" w:hAnsi="Symbol" w:hint="default"/>
+      </w:rPr>
+    </w:lvl>
+    <w:lvl w:ilvl="1" w:tplc="40090003" w:tentative="1">
+      <w:start w:val="1"/>
+      <w:numFmt w:val="bullet"/>
+      <w:lvlText w:val="o"/>
+      <w:lvlJc w:val="left"/>
+      <w:pPr>
+        <w:ind w:left="1440" w:hanging="360"/>
+      </w:pPr>
+      <w:rPr>
+        <w:rFonts w:ascii="Courier New" w:hAnsi="Courier New" w:cs="Courier New" w:hint="default"/>
+      </w:rPr>
+    </w:lvl>
+    <w:lvl w:ilvl="2" w:tplc="40090005" w:tentative="1">
+      <w:start w:val="1"/>
+      <w:numFmt w:val="bullet"/>
+      <w:lvlText w:val=""/>
+      <w:lvlJc w:val="left"/>
+      <w:pPr>
+        <w:ind w:left="2160" w:hanging="360"/>
+      </w:pPr>
+      <w:rPr>
+        <w:rFonts w:ascii="Wingdings" w:hAnsi="Wingdings" w:hint="default"/>
+      </w:rPr>
+    </w:lvl>
+    <w:lvl w:ilvl="3" w:tplc="40090001" w:tentative="1">
+      <w:start w:val="1"/>
+      <w:numFmt w:val="bullet"/>
+      <w:lvlText w:val=""/>
+      <w:lvlJc w:val="left"/>
+      <w:pPr>
+        <w:ind w:left="2880" w:hanging="360"/>
+      </w:pPr>
+      <w:rPr>
+        <w:rFonts w:ascii="Symbol" w:hAnsi="Symbol" w:hint="default"/>
+      </w:rPr>
+    </w:lvl>
+    <w:lvl w:ilvl="4" w:tplc="40090003" w:tentative="1">
+      <w:start w:val="1"/>
+      <w:numFmt w:val="bullet"/>
+      <w:lvlText w:val="o"/>
+      <w:lvlJc w:val="left"/>
+      <w:pPr>
+        <w:ind w:left="3600" w:hanging="360"/>
+      </w:pPr>
+      <w:rPr>
+        <w:rFonts w:ascii="Courier New" w:hAnsi="Courier New" w:cs="Courier New" w:hint="default"/>
+      </w:rPr>
+    </w:lvl>
+    <w:lvl w:ilvl="5" w:tplc="40090005" w:tentative="1">
+      <w:start w:val="1"/>
+      <w:numFmt w:val="bullet"/>
+      <w:lvlText w:val=""/>
+      <w:lvlJc w:val="left"/>
+      <w:pPr>
+        <w:ind w:left="4320" w:hanging="360"/>
+      </w:pPr>
+      <w:rPr>
+        <w:rFonts w:ascii="Wingdings" w:hAnsi="Wingdings" w:hint="default"/>
+      </w:rPr>
+    </w:lvl>
+    <w:lvl w:ilvl="6" w:tplc="40090001" w:tentative="1">
+      <w:start w:val="1"/>
+      <w:numFmt w:val="bullet"/>
+      <w:lvlText w:val=""/>
+      <w:lvlJc w:val="left"/>
+      <w:pPr>
+        <w:ind w:left="5040" w:hanging="360"/>
+      </w:pPr>
+      <w:rPr>
+        <w:rFonts w:ascii="Symbol" w:hAnsi="Symbol" w:hint="default"/>
+      </w:rPr>
+    </w:lvl>
+    <w:lvl w:ilvl="7" w:tplc="40090003" w:tentative="1">
+      <w:start w:val="1"/>
+      <w:numFmt w:val="bullet"/>
+      <w:lvlText w:val="o"/>
+      <w:lvlJc w:val="left"/>
+      <w:pPr>
+        <w:ind w:left="5760" w:hanging="360"/>
+      </w:pPr>
+      <w:rPr>
+        <w:rFonts w:ascii="Courier New" w:hAnsi="Courier New" w:cs="Courier New" w:hint="default"/>
+      </w:rPr>
+    </w:lvl>
+    <w:lvl w:ilvl="8" w:tplc="40090005" w:tentative="1">
+      <w:start w:val="1"/>
+      <w:numFmt w:val="bullet"/>
+      <w:lvlText w:val=""/>
+      <w:lvlJc w:val="left"/>
+      <w:pPr>
+        <w:ind w:left="6480" w:hanging="360"/>
+      </w:pPr>
+      <w:rPr>
+        <w:rFonts w:ascii="Wingdings" w:hAnsi="Wingdings" w:hint="default"/>
+      </w:rPr>
+    </w:lvl>
+  </w:abstractNum>
+  <w:num w:numId="1" w16cid:durableId="835152166">
+    <w:abstractNumId w:val="2"/>
+  </w:num>
+  <w:num w:numId="2" w16cid:durableId="1169522043">
+    <w:abstractNumId w:val="3"/>
+  </w:num>
+  <w:num w:numId="3" w16cid:durableId="484400752">
+    <w:abstractNumId w:val="0"/>
+  </w:num>
+  <w:num w:numId="4" w16cid:durableId="65686153">
+    <w:abstractNumId w:val="1"/>
+  </w:num>
+</w:numbering>
 </file>
 
 <file path=word/people.xml><?xml version="1.0" encoding="utf-8"?>
@@ -2015,6 +3935,15 @@
   </w15:person>
   <w15:person w15:author="Martin Gerdin Wärnberg">
     <w15:presenceInfo w15:providerId="AD" w15:userId="S::martin.gerdin@ki.se::77153f61-4c5f-462a-acd4-483a5c64ba16"/>
+  </w15:person>
+  <w15:person w15:author="Prashant Kharat">
+    <w15:presenceInfo w15:providerId="AD" w15:userId="S::pkharat-gis@george-services.com::d45cbe0a-725f-4e80-811c-40cd720b0a00"/>
+  </w15:person>
+  <w15:person w15:author="Monty Khajanchi">
+    <w15:presenceInfo w15:providerId="None" w15:userId="Monty Khajanchi"/>
+  </w15:person>
+  <w15:person w15:author="Jessica Kasza">
+    <w15:presenceInfo w15:providerId="AD" w15:userId="S-1-5-21-948756243-734778046-674738317-443129"/>
   </w15:person>
 </w15:people>
 </file>
@@ -2989,7 +4918,6 @@
     <w:basedOn w:val="Normal"/>
     <w:link w:val="CommentTextChar"/>
     <w:uiPriority w:val="99"/>
-    <w:semiHidden/>
     <w:unhideWhenUsed/>
     <w:rsid w:val="003764F3"/>
     <w:rPr>
@@ -3002,7 +4930,6 @@
     <w:basedOn w:val="DefaultParagraphFont"/>
     <w:link w:val="CommentText"/>
     <w:uiPriority w:val="99"/>
-    <w:semiHidden/>
     <w:rsid w:val="003764F3"/>
     <w:rPr>
       <w:rFonts w:cs="Mangal"/>
@@ -3053,6 +4980,63 @@
     <w:rPr>
       <w:rFonts w:cs="Mangal"/>
       <w:lang w:val="en-US"/>
+    </w:rPr>
+  </w:style>
+  <w:style w:type="table" w:styleId="TableGrid">
+    <w:name w:val="Table Grid"/>
+    <w:basedOn w:val="TableNormal"/>
+    <w:uiPriority w:val="39"/>
+    <w:rsid w:val="00416ECB"/>
+    <w:pPr>
+      <w:spacing w:after="0" w:line="240" w:lineRule="auto"/>
+    </w:pPr>
+    <w:rPr>
+      <w:rFonts w:eastAsiaTheme="minorEastAsia"/>
+      <w:szCs w:val="24"/>
+      <w:lang w:val="en-IN" w:eastAsia="zh-CN" w:bidi="ar-SA"/>
+    </w:rPr>
+    <w:tblPr>
+      <w:tblBorders>
+        <w:top w:val="single" w:sz="4" w:space="0" w:color="auto"/>
+        <w:left w:val="single" w:sz="4" w:space="0" w:color="auto"/>
+        <w:bottom w:val="single" w:sz="4" w:space="0" w:color="auto"/>
+        <w:right w:val="single" w:sz="4" w:space="0" w:color="auto"/>
+        <w:insideH w:val="single" w:sz="4" w:space="0" w:color="auto"/>
+        <w:insideV w:val="single" w:sz="4" w:space="0" w:color="auto"/>
+      </w:tblBorders>
+    </w:tblPr>
+  </w:style>
+  <w:style w:type="paragraph" w:styleId="BalloonText">
+    <w:name w:val="Balloon Text"/>
+    <w:basedOn w:val="Normal"/>
+    <w:link w:val="BalloonTextChar"/>
+    <w:uiPriority w:val="99"/>
+    <w:semiHidden/>
+    <w:unhideWhenUsed/>
+    <w:rsid w:val="002A1C67"/>
+    <w:rPr>
+      <w:rFonts w:ascii="Segoe UI" w:hAnsi="Segoe UI" w:cs="Mangal"/>
+      <w:sz w:val="18"/>
+      <w:szCs w:val="16"/>
+    </w:rPr>
+  </w:style>
+  <w:style w:type="character" w:customStyle="1" w:styleId="BalloonTextChar">
+    <w:name w:val="Balloon Text Char"/>
+    <w:basedOn w:val="DefaultParagraphFont"/>
+    <w:link w:val="BalloonText"/>
+    <w:uiPriority w:val="99"/>
+    <w:semiHidden/>
+    <w:rsid w:val="002A1C67"/>
+    <w:rPr>
+      <w:rFonts w:ascii="Segoe UI" w:eastAsia="Times New Roman" w:hAnsi="Segoe UI" w:cs="Mangal"/>
+      <w:color w:val="242424"/>
+      <w:kern w:val="0"/>
+      <w:sz w:val="18"/>
+      <w:szCs w:val="16"/>
+      <w:bdr w:val="none" w:sz="0" w:space="0" w:color="auto" w:frame="1"/>
+      <w:shd w:val="clear" w:color="auto" w:fill="FFFFFF"/>
+      <w:lang w:eastAsia="en-GB"/>
+      <w14:ligatures w14:val="none"/>
     </w:rPr>
   </w:style>
 </w:styles>

</xml_diff>